<commit_message>
completed the notes and added the table of content to the notes
</commit_message>
<xml_diff>
--- a/2. Data Transmission/Getting Started.docx
+++ b/2. Data Transmission/Getting Started.docx
@@ -2,8 +2,1761 @@
 <file path=word/document.xml><?xml version="1.0" encoding="utf-8"?>
 <w:document xmlns:wpc="http://schemas.microsoft.com/office/word/2010/wordprocessingCanvas" xmlns:cx="http://schemas.microsoft.com/office/drawing/2014/chartex" xmlns:cx1="http://schemas.microsoft.com/office/drawing/2015/9/8/chartex" xmlns:cx2="http://schemas.microsoft.com/office/drawing/2015/10/21/chartex" xmlns:cx3="http://schemas.microsoft.com/office/drawing/2016/5/9/chartex" xmlns:cx4="http://schemas.microsoft.com/office/drawing/2016/5/10/chartex" xmlns:cx5="http://schemas.microsoft.com/office/drawing/2016/5/11/chartex" xmlns:cx6="http://schemas.microsoft.com/office/drawing/2016/5/12/chartex" xmlns:cx7="http://schemas.microsoft.com/office/drawing/2016/5/13/chartex" xmlns:cx8="http://schemas.microsoft.com/office/drawing/2016/5/14/chartex" xmlns:mc="http://schemas.openxmlformats.org/markup-compatibility/2006" xmlns:aink="http://schemas.microsoft.com/office/drawing/2016/ink" xmlns:am3d="http://schemas.microsoft.com/office/drawing/2017/model3d" xmlns:o="urn:schemas-microsoft-com:office:office" xmlns:oel="http://schemas.microsoft.com/office/2019/extlst" xmlns:r="http://schemas.openxmlformats.org/officeDocument/2006/relationships" xmlns:m="http://schemas.openxmlformats.org/officeDocument/2006/math" xmlns:v="urn:schemas-microsoft-com:vml" xmlns:wp14="http://schemas.microsoft.com/office/word/2010/wordprocessingDrawing" xmlns:wp="http://schemas.openxmlformats.org/drawingml/2006/wordprocessingDrawing" xmlns:w10="urn:schemas-microsoft-com:office:word" xmlns:w="http://schemas.openxmlformats.org/wordprocessingml/2006/main" xmlns:w14="http://schemas.microsoft.com/office/word/2010/wordml" xmlns:w15="http://schemas.microsoft.com/office/word/2012/wordml" xmlns:w16cex="http://schemas.microsoft.com/office/word/2018/wordml/cex" xmlns:w16cid="http://schemas.microsoft.com/office/word/2016/wordml/cid" xmlns:w16="http://schemas.microsoft.com/office/word/2018/wordml" xmlns:w16du="http://schemas.microsoft.com/office/word/2023/wordml/word16du" xmlns:w16sdtdh="http://schemas.microsoft.com/office/word/2020/wordml/sdtdatahash" xmlns:w16sdtfl="http://schemas.microsoft.com/office/word/2024/wordml/sdtformatlock" xmlns:w16se="http://schemas.microsoft.com/office/word/2015/wordml/symex" xmlns:wpg="http://schemas.microsoft.com/office/word/2010/wordprocessingGroup" xmlns:wpi="http://schemas.microsoft.com/office/word/2010/wordprocessingInk" xmlns:wne="http://schemas.microsoft.com/office/word/2006/wordml" xmlns:wps="http://schemas.microsoft.com/office/word/2010/wordprocessingShape" mc:Ignorable="w14 w15 w16se w16cid w16 w16cex w16sdtdh w16sdtfl w16du wp14">
   <w:body>
-    <w:p>
-      <w:r>
+    <w:sdt>
+      <w:sdtPr>
+        <w:id w:val="1241992438"/>
+        <w:docPartObj>
+          <w:docPartGallery w:val="Table of Contents"/>
+          <w:docPartUnique/>
+        </w:docPartObj>
+      </w:sdtPr>
+      <w:sdtEndPr>
+        <w:rPr>
+          <w:rFonts w:asciiTheme="minorHAnsi" w:eastAsiaTheme="minorHAnsi" w:hAnsiTheme="minorHAnsi" w:cstheme="minorBidi"/>
+          <w:b/>
+          <w:bCs/>
+          <w:noProof/>
+          <w:color w:val="auto"/>
+          <w:sz w:val="22"/>
+          <w:szCs w:val="22"/>
+        </w:rPr>
+      </w:sdtEndPr>
+      <w:sdtContent>
+        <w:p>
+          <w:pPr>
+            <w:pStyle w:val="TOCHeading"/>
+          </w:pPr>
+          <w:r>
+            <w:t>Contents</w:t>
+          </w:r>
+        </w:p>
+        <w:p>
+          <w:pPr>
+            <w:pStyle w:val="TOC1"/>
+            <w:tabs>
+              <w:tab w:val="right" w:leader="dot" w:pos="9350"/>
+            </w:tabs>
+            <w:rPr>
+              <w:noProof/>
+            </w:rPr>
+          </w:pPr>
+          <w:r>
+            <w:fldChar w:fldCharType="begin"/>
+          </w:r>
+          <w:r>
+            <w:instrText xml:space="preserve"> TOC \o "1-3" \h \z \u </w:instrText>
+          </w:r>
+          <w:r>
+            <w:fldChar w:fldCharType="separate"/>
+          </w:r>
+          <w:hyperlink w:anchor="_Toc235569372" w:history="1">
+            <w:r>
+              <w:rPr>
+                <w:rStyle w:val="Hyperlink"/>
+                <w:noProof/>
+              </w:rPr>
+              <w:t>2.1 The structure of a data packet</w:t>
+            </w:r>
+            <w:r>
+              <w:rPr>
+                <w:noProof/>
+                <w:webHidden/>
+              </w:rPr>
+              <w:tab/>
+            </w:r>
+            <w:r>
+              <w:rPr>
+                <w:noProof/>
+                <w:webHidden/>
+              </w:rPr>
+              <w:fldChar w:fldCharType="begin"/>
+            </w:r>
+            <w:r>
+              <w:rPr>
+                <w:noProof/>
+                <w:webHidden/>
+              </w:rPr>
+              <w:instrText xml:space="preserve"> PAGEREF _Toc235569372 \h </w:instrText>
+            </w:r>
+            <w:r>
+              <w:rPr>
+                <w:noProof/>
+                <w:webHidden/>
+              </w:rPr>
+            </w:r>
+            <w:r>
+              <w:rPr>
+                <w:noProof/>
+                <w:webHidden/>
+              </w:rPr>
+              <w:fldChar w:fldCharType="separate"/>
+            </w:r>
+            <w:r>
+              <w:rPr>
+                <w:noProof/>
+                <w:webHidden/>
+              </w:rPr>
+              <w:t>2</w:t>
+            </w:r>
+            <w:r>
+              <w:rPr>
+                <w:noProof/>
+                <w:webHidden/>
+              </w:rPr>
+              <w:fldChar w:fldCharType="end"/>
+            </w:r>
+          </w:hyperlink>
+        </w:p>
+        <w:p>
+          <w:pPr>
+            <w:pStyle w:val="TOC2"/>
+            <w:tabs>
+              <w:tab w:val="right" w:leader="dot" w:pos="9350"/>
+            </w:tabs>
+            <w:rPr>
+              <w:noProof/>
+            </w:rPr>
+          </w:pPr>
+          <w:hyperlink w:anchor="_Toc235569373" w:history="1">
+            <w:r>
+              <w:rPr>
+                <w:rStyle w:val="Hyperlink"/>
+                <w:noProof/>
+              </w:rPr>
+              <w:t>Questions</w:t>
+            </w:r>
+            <w:r>
+              <w:rPr>
+                <w:noProof/>
+                <w:webHidden/>
+              </w:rPr>
+              <w:tab/>
+            </w:r>
+            <w:r>
+              <w:rPr>
+                <w:noProof/>
+                <w:webHidden/>
+              </w:rPr>
+              <w:fldChar w:fldCharType="begin"/>
+            </w:r>
+            <w:r>
+              <w:rPr>
+                <w:noProof/>
+                <w:webHidden/>
+              </w:rPr>
+              <w:instrText xml:space="preserve"> PAGEREF _Toc235569373 \h </w:instrText>
+            </w:r>
+            <w:r>
+              <w:rPr>
+                <w:noProof/>
+                <w:webHidden/>
+              </w:rPr>
+            </w:r>
+            <w:r>
+              <w:rPr>
+                <w:noProof/>
+                <w:webHidden/>
+              </w:rPr>
+              <w:fldChar w:fldCharType="separate"/>
+            </w:r>
+            <w:r>
+              <w:rPr>
+                <w:noProof/>
+                <w:webHidden/>
+              </w:rPr>
+              <w:t>2</w:t>
+            </w:r>
+            <w:r>
+              <w:rPr>
+                <w:noProof/>
+                <w:webHidden/>
+              </w:rPr>
+              <w:fldChar w:fldCharType="end"/>
+            </w:r>
+          </w:hyperlink>
+        </w:p>
+        <w:p>
+          <w:pPr>
+            <w:pStyle w:val="TOC2"/>
+            <w:tabs>
+              <w:tab w:val="right" w:leader="dot" w:pos="9350"/>
+            </w:tabs>
+            <w:rPr>
+              <w:noProof/>
+            </w:rPr>
+          </w:pPr>
+          <w:hyperlink w:anchor="_Toc235569374" w:history="1">
+            <w:r>
+              <w:rPr>
+                <w:rStyle w:val="Hyperlink"/>
+                <w:noProof/>
+              </w:rPr>
+              <w:t>Activity 2.1</w:t>
+            </w:r>
+            <w:r>
+              <w:rPr>
+                <w:noProof/>
+                <w:webHidden/>
+              </w:rPr>
+              <w:tab/>
+            </w:r>
+            <w:r>
+              <w:rPr>
+                <w:noProof/>
+                <w:webHidden/>
+              </w:rPr>
+              <w:fldChar w:fldCharType="begin"/>
+            </w:r>
+            <w:r>
+              <w:rPr>
+                <w:noProof/>
+                <w:webHidden/>
+              </w:rPr>
+              <w:instrText xml:space="preserve"> PAGEREF _Toc235569374 \h </w:instrText>
+            </w:r>
+            <w:r>
+              <w:rPr>
+                <w:noProof/>
+                <w:webHidden/>
+              </w:rPr>
+            </w:r>
+            <w:r>
+              <w:rPr>
+                <w:noProof/>
+                <w:webHidden/>
+              </w:rPr>
+              <w:fldChar w:fldCharType="separate"/>
+            </w:r>
+            <w:r>
+              <w:rPr>
+                <w:noProof/>
+                <w:webHidden/>
+              </w:rPr>
+              <w:t>3</w:t>
+            </w:r>
+            <w:r>
+              <w:rPr>
+                <w:noProof/>
+                <w:webHidden/>
+              </w:rPr>
+              <w:fldChar w:fldCharType="end"/>
+            </w:r>
+          </w:hyperlink>
+        </w:p>
+        <w:p>
+          <w:pPr>
+            <w:pStyle w:val="TOC1"/>
+            <w:tabs>
+              <w:tab w:val="right" w:leader="dot" w:pos="9350"/>
+            </w:tabs>
+            <w:rPr>
+              <w:noProof/>
+            </w:rPr>
+          </w:pPr>
+          <w:hyperlink w:anchor="_Toc235569375" w:history="1">
+            <w:r>
+              <w:rPr>
+                <w:rStyle w:val="Hyperlink"/>
+                <w:noProof/>
+              </w:rPr>
+              <w:t>2.2 Packet Switching</w:t>
+            </w:r>
+            <w:r>
+              <w:rPr>
+                <w:noProof/>
+                <w:webHidden/>
+              </w:rPr>
+              <w:tab/>
+            </w:r>
+            <w:r>
+              <w:rPr>
+                <w:noProof/>
+                <w:webHidden/>
+              </w:rPr>
+              <w:fldChar w:fldCharType="begin"/>
+            </w:r>
+            <w:r>
+              <w:rPr>
+                <w:noProof/>
+                <w:webHidden/>
+              </w:rPr>
+              <w:instrText xml:space="preserve"> PAGEREF _Toc235569375 \h </w:instrText>
+            </w:r>
+            <w:r>
+              <w:rPr>
+                <w:noProof/>
+                <w:webHidden/>
+              </w:rPr>
+            </w:r>
+            <w:r>
+              <w:rPr>
+                <w:noProof/>
+                <w:webHidden/>
+              </w:rPr>
+              <w:fldChar w:fldCharType="separate"/>
+            </w:r>
+            <w:r>
+              <w:rPr>
+                <w:noProof/>
+                <w:webHidden/>
+              </w:rPr>
+              <w:t>3</w:t>
+            </w:r>
+            <w:r>
+              <w:rPr>
+                <w:noProof/>
+                <w:webHidden/>
+              </w:rPr>
+              <w:fldChar w:fldCharType="end"/>
+            </w:r>
+          </w:hyperlink>
+        </w:p>
+        <w:p>
+          <w:pPr>
+            <w:pStyle w:val="TOC2"/>
+            <w:tabs>
+              <w:tab w:val="right" w:leader="dot" w:pos="9350"/>
+            </w:tabs>
+            <w:rPr>
+              <w:noProof/>
+            </w:rPr>
+          </w:pPr>
+          <w:hyperlink w:anchor="_Toc235569376" w:history="1">
+            <w:r>
+              <w:rPr>
+                <w:rStyle w:val="Hyperlink"/>
+                <w:noProof/>
+              </w:rPr>
+              <w:t>Activity 2.2</w:t>
+            </w:r>
+            <w:r>
+              <w:rPr>
+                <w:noProof/>
+                <w:webHidden/>
+              </w:rPr>
+              <w:tab/>
+            </w:r>
+            <w:r>
+              <w:rPr>
+                <w:noProof/>
+                <w:webHidden/>
+              </w:rPr>
+              <w:fldChar w:fldCharType="begin"/>
+            </w:r>
+            <w:r>
+              <w:rPr>
+                <w:noProof/>
+                <w:webHidden/>
+              </w:rPr>
+              <w:instrText xml:space="preserve"> PAGEREF _Toc235569376 \h </w:instrText>
+            </w:r>
+            <w:r>
+              <w:rPr>
+                <w:noProof/>
+                <w:webHidden/>
+              </w:rPr>
+            </w:r>
+            <w:r>
+              <w:rPr>
+                <w:noProof/>
+                <w:webHidden/>
+              </w:rPr>
+              <w:fldChar w:fldCharType="separate"/>
+            </w:r>
+            <w:r>
+              <w:rPr>
+                <w:noProof/>
+                <w:webHidden/>
+              </w:rPr>
+              <w:t>3</w:t>
+            </w:r>
+            <w:r>
+              <w:rPr>
+                <w:noProof/>
+                <w:webHidden/>
+              </w:rPr>
+              <w:fldChar w:fldCharType="end"/>
+            </w:r>
+          </w:hyperlink>
+        </w:p>
+        <w:p>
+          <w:pPr>
+            <w:pStyle w:val="TOC3"/>
+            <w:tabs>
+              <w:tab w:val="right" w:leader="dot" w:pos="9350"/>
+            </w:tabs>
+            <w:rPr>
+              <w:noProof/>
+            </w:rPr>
+          </w:pPr>
+          <w:hyperlink w:anchor="_Toc235569377" w:history="1">
+            <w:r>
+              <w:rPr>
+                <w:rStyle w:val="Hyperlink"/>
+                <w:noProof/>
+              </w:rPr>
+              <w:t>Self-Assessment:</w:t>
+            </w:r>
+            <w:r>
+              <w:rPr>
+                <w:noProof/>
+                <w:webHidden/>
+              </w:rPr>
+              <w:tab/>
+            </w:r>
+            <w:r>
+              <w:rPr>
+                <w:noProof/>
+                <w:webHidden/>
+              </w:rPr>
+              <w:fldChar w:fldCharType="begin"/>
+            </w:r>
+            <w:r>
+              <w:rPr>
+                <w:noProof/>
+                <w:webHidden/>
+              </w:rPr>
+              <w:instrText xml:space="preserve"> PAGEREF _Toc235569377 \h </w:instrText>
+            </w:r>
+            <w:r>
+              <w:rPr>
+                <w:noProof/>
+                <w:webHidden/>
+              </w:rPr>
+            </w:r>
+            <w:r>
+              <w:rPr>
+                <w:noProof/>
+                <w:webHidden/>
+              </w:rPr>
+              <w:fldChar w:fldCharType="separate"/>
+            </w:r>
+            <w:r>
+              <w:rPr>
+                <w:noProof/>
+                <w:webHidden/>
+              </w:rPr>
+              <w:t>5</w:t>
+            </w:r>
+            <w:r>
+              <w:rPr>
+                <w:noProof/>
+                <w:webHidden/>
+              </w:rPr>
+              <w:fldChar w:fldCharType="end"/>
+            </w:r>
+          </w:hyperlink>
+        </w:p>
+        <w:p>
+          <w:pPr>
+            <w:pStyle w:val="TOC1"/>
+            <w:tabs>
+              <w:tab w:val="right" w:leader="dot" w:pos="9350"/>
+            </w:tabs>
+            <w:rPr>
+              <w:noProof/>
+            </w:rPr>
+          </w:pPr>
+          <w:hyperlink w:anchor="_Toc235569378" w:history="1">
+            <w:r>
+              <w:rPr>
+                <w:rStyle w:val="Hyperlink"/>
+                <w:noProof/>
+              </w:rPr>
+              <w:t>2.3 Methods of Data Transmission</w:t>
+            </w:r>
+            <w:r>
+              <w:rPr>
+                <w:noProof/>
+                <w:webHidden/>
+              </w:rPr>
+              <w:tab/>
+            </w:r>
+            <w:r>
+              <w:rPr>
+                <w:noProof/>
+                <w:webHidden/>
+              </w:rPr>
+              <w:fldChar w:fldCharType="begin"/>
+            </w:r>
+            <w:r>
+              <w:rPr>
+                <w:noProof/>
+                <w:webHidden/>
+              </w:rPr>
+              <w:instrText xml:space="preserve"> PAGEREF _Toc235569378 \h </w:instrText>
+            </w:r>
+            <w:r>
+              <w:rPr>
+                <w:noProof/>
+                <w:webHidden/>
+              </w:rPr>
+            </w:r>
+            <w:r>
+              <w:rPr>
+                <w:noProof/>
+                <w:webHidden/>
+              </w:rPr>
+              <w:fldChar w:fldCharType="separate"/>
+            </w:r>
+            <w:r>
+              <w:rPr>
+                <w:noProof/>
+                <w:webHidden/>
+              </w:rPr>
+              <w:t>5</w:t>
+            </w:r>
+            <w:r>
+              <w:rPr>
+                <w:noProof/>
+                <w:webHidden/>
+              </w:rPr>
+              <w:fldChar w:fldCharType="end"/>
+            </w:r>
+          </w:hyperlink>
+        </w:p>
+        <w:p>
+          <w:pPr>
+            <w:pStyle w:val="TOC2"/>
+            <w:tabs>
+              <w:tab w:val="right" w:leader="dot" w:pos="9350"/>
+            </w:tabs>
+            <w:rPr>
+              <w:noProof/>
+            </w:rPr>
+          </w:pPr>
+          <w:hyperlink w:anchor="_Toc235569379" w:history="1">
+            <w:r>
+              <w:rPr>
+                <w:rStyle w:val="Hyperlink"/>
+                <w:noProof/>
+              </w:rPr>
+              <w:t>Question</w:t>
+            </w:r>
+            <w:r>
+              <w:rPr>
+                <w:noProof/>
+                <w:webHidden/>
+              </w:rPr>
+              <w:tab/>
+            </w:r>
+            <w:r>
+              <w:rPr>
+                <w:noProof/>
+                <w:webHidden/>
+              </w:rPr>
+              <w:fldChar w:fldCharType="begin"/>
+            </w:r>
+            <w:r>
+              <w:rPr>
+                <w:noProof/>
+                <w:webHidden/>
+              </w:rPr>
+              <w:instrText xml:space="preserve"> PAGEREF _Toc235569379 \h </w:instrText>
+            </w:r>
+            <w:r>
+              <w:rPr>
+                <w:noProof/>
+                <w:webHidden/>
+              </w:rPr>
+            </w:r>
+            <w:r>
+              <w:rPr>
+                <w:noProof/>
+                <w:webHidden/>
+              </w:rPr>
+              <w:fldChar w:fldCharType="separate"/>
+            </w:r>
+            <w:r>
+              <w:rPr>
+                <w:noProof/>
+                <w:webHidden/>
+              </w:rPr>
+              <w:t>5</w:t>
+            </w:r>
+            <w:r>
+              <w:rPr>
+                <w:noProof/>
+                <w:webHidden/>
+              </w:rPr>
+              <w:fldChar w:fldCharType="end"/>
+            </w:r>
+          </w:hyperlink>
+        </w:p>
+        <w:p>
+          <w:pPr>
+            <w:pStyle w:val="TOC2"/>
+            <w:tabs>
+              <w:tab w:val="right" w:leader="dot" w:pos="9350"/>
+            </w:tabs>
+            <w:rPr>
+              <w:noProof/>
+            </w:rPr>
+          </w:pPr>
+          <w:hyperlink w:anchor="_Toc235569380" w:history="1">
+            <w:r>
+              <w:rPr>
+                <w:rStyle w:val="Hyperlink"/>
+                <w:noProof/>
+              </w:rPr>
+              <w:t>Activity 2.3</w:t>
+            </w:r>
+            <w:r>
+              <w:rPr>
+                <w:noProof/>
+                <w:webHidden/>
+              </w:rPr>
+              <w:tab/>
+            </w:r>
+            <w:r>
+              <w:rPr>
+                <w:noProof/>
+                <w:webHidden/>
+              </w:rPr>
+              <w:fldChar w:fldCharType="begin"/>
+            </w:r>
+            <w:r>
+              <w:rPr>
+                <w:noProof/>
+                <w:webHidden/>
+              </w:rPr>
+              <w:instrText xml:space="preserve"> PAGEREF _Toc235569380 \h </w:instrText>
+            </w:r>
+            <w:r>
+              <w:rPr>
+                <w:noProof/>
+                <w:webHidden/>
+              </w:rPr>
+            </w:r>
+            <w:r>
+              <w:rPr>
+                <w:noProof/>
+                <w:webHidden/>
+              </w:rPr>
+              <w:fldChar w:fldCharType="separate"/>
+            </w:r>
+            <w:r>
+              <w:rPr>
+                <w:noProof/>
+                <w:webHidden/>
+              </w:rPr>
+              <w:t>6</w:t>
+            </w:r>
+            <w:r>
+              <w:rPr>
+                <w:noProof/>
+                <w:webHidden/>
+              </w:rPr>
+              <w:fldChar w:fldCharType="end"/>
+            </w:r>
+          </w:hyperlink>
+        </w:p>
+        <w:p>
+          <w:pPr>
+            <w:pStyle w:val="TOC2"/>
+            <w:tabs>
+              <w:tab w:val="right" w:leader="dot" w:pos="9350"/>
+            </w:tabs>
+            <w:rPr>
+              <w:noProof/>
+            </w:rPr>
+          </w:pPr>
+          <w:hyperlink w:anchor="_Toc235569381" w:history="1">
+            <w:r>
+              <w:rPr>
+                <w:rStyle w:val="Hyperlink"/>
+                <w:noProof/>
+              </w:rPr>
+              <w:t>Activity 2.4</w:t>
+            </w:r>
+            <w:r>
+              <w:rPr>
+                <w:noProof/>
+                <w:webHidden/>
+              </w:rPr>
+              <w:tab/>
+            </w:r>
+            <w:r>
+              <w:rPr>
+                <w:noProof/>
+                <w:webHidden/>
+              </w:rPr>
+              <w:fldChar w:fldCharType="begin"/>
+            </w:r>
+            <w:r>
+              <w:rPr>
+                <w:noProof/>
+                <w:webHidden/>
+              </w:rPr>
+              <w:instrText xml:space="preserve"> PAGEREF _Toc235569381 \h </w:instrText>
+            </w:r>
+            <w:r>
+              <w:rPr>
+                <w:noProof/>
+                <w:webHidden/>
+              </w:rPr>
+            </w:r>
+            <w:r>
+              <w:rPr>
+                <w:noProof/>
+                <w:webHidden/>
+              </w:rPr>
+              <w:fldChar w:fldCharType="separate"/>
+            </w:r>
+            <w:r>
+              <w:rPr>
+                <w:noProof/>
+                <w:webHidden/>
+              </w:rPr>
+              <w:t>6</w:t>
+            </w:r>
+            <w:r>
+              <w:rPr>
+                <w:noProof/>
+                <w:webHidden/>
+              </w:rPr>
+              <w:fldChar w:fldCharType="end"/>
+            </w:r>
+          </w:hyperlink>
+        </w:p>
+        <w:p>
+          <w:pPr>
+            <w:pStyle w:val="TOC1"/>
+            <w:tabs>
+              <w:tab w:val="right" w:leader="dot" w:pos="9350"/>
+            </w:tabs>
+            <w:rPr>
+              <w:noProof/>
+            </w:rPr>
+          </w:pPr>
+          <w:hyperlink w:anchor="_Toc235569382" w:history="1">
+            <w:r>
+              <w:rPr>
+                <w:rStyle w:val="Hyperlink"/>
+                <w:noProof/>
+              </w:rPr>
+              <w:t>2.4 The Universal Serial Bus (USB) Interface</w:t>
+            </w:r>
+            <w:r>
+              <w:rPr>
+                <w:noProof/>
+                <w:webHidden/>
+              </w:rPr>
+              <w:tab/>
+            </w:r>
+            <w:r>
+              <w:rPr>
+                <w:noProof/>
+                <w:webHidden/>
+              </w:rPr>
+              <w:fldChar w:fldCharType="begin"/>
+            </w:r>
+            <w:r>
+              <w:rPr>
+                <w:noProof/>
+                <w:webHidden/>
+              </w:rPr>
+              <w:instrText xml:space="preserve"> PAGEREF _Toc235569382 \h </w:instrText>
+            </w:r>
+            <w:r>
+              <w:rPr>
+                <w:noProof/>
+                <w:webHidden/>
+              </w:rPr>
+            </w:r>
+            <w:r>
+              <w:rPr>
+                <w:noProof/>
+                <w:webHidden/>
+              </w:rPr>
+              <w:fldChar w:fldCharType="separate"/>
+            </w:r>
+            <w:r>
+              <w:rPr>
+                <w:noProof/>
+                <w:webHidden/>
+              </w:rPr>
+              <w:t>6</w:t>
+            </w:r>
+            <w:r>
+              <w:rPr>
+                <w:noProof/>
+                <w:webHidden/>
+              </w:rPr>
+              <w:fldChar w:fldCharType="end"/>
+            </w:r>
+          </w:hyperlink>
+        </w:p>
+        <w:p>
+          <w:pPr>
+            <w:pStyle w:val="TOC2"/>
+            <w:tabs>
+              <w:tab w:val="right" w:leader="dot" w:pos="9350"/>
+            </w:tabs>
+            <w:rPr>
+              <w:noProof/>
+            </w:rPr>
+          </w:pPr>
+          <w:hyperlink w:anchor="_Toc235569383" w:history="1">
+            <w:r>
+              <w:rPr>
+                <w:rStyle w:val="Hyperlink"/>
+                <w:noProof/>
+              </w:rPr>
+              <w:t>Activity 2.5</w:t>
+            </w:r>
+            <w:r>
+              <w:rPr>
+                <w:noProof/>
+                <w:webHidden/>
+              </w:rPr>
+              <w:tab/>
+            </w:r>
+            <w:r>
+              <w:rPr>
+                <w:noProof/>
+                <w:webHidden/>
+              </w:rPr>
+              <w:fldChar w:fldCharType="begin"/>
+            </w:r>
+            <w:r>
+              <w:rPr>
+                <w:noProof/>
+                <w:webHidden/>
+              </w:rPr>
+              <w:instrText xml:space="preserve"> PAGEREF _Toc235569383 \h </w:instrText>
+            </w:r>
+            <w:r>
+              <w:rPr>
+                <w:noProof/>
+                <w:webHidden/>
+              </w:rPr>
+            </w:r>
+            <w:r>
+              <w:rPr>
+                <w:noProof/>
+                <w:webHidden/>
+              </w:rPr>
+              <w:fldChar w:fldCharType="separate"/>
+            </w:r>
+            <w:r>
+              <w:rPr>
+                <w:noProof/>
+                <w:webHidden/>
+              </w:rPr>
+              <w:t>7</w:t>
+            </w:r>
+            <w:r>
+              <w:rPr>
+                <w:noProof/>
+                <w:webHidden/>
+              </w:rPr>
+              <w:fldChar w:fldCharType="end"/>
+            </w:r>
+          </w:hyperlink>
+        </w:p>
+        <w:p>
+          <w:pPr>
+            <w:pStyle w:val="TOC2"/>
+            <w:tabs>
+              <w:tab w:val="right" w:leader="dot" w:pos="9350"/>
+            </w:tabs>
+            <w:rPr>
+              <w:noProof/>
+            </w:rPr>
+          </w:pPr>
+          <w:hyperlink w:anchor="_Toc235569384" w:history="1">
+            <w:r>
+              <w:rPr>
+                <w:rStyle w:val="Hyperlink"/>
+                <w:noProof/>
+              </w:rPr>
+              <w:t>ACTIVITY 2.6</w:t>
+            </w:r>
+            <w:r>
+              <w:rPr>
+                <w:noProof/>
+                <w:webHidden/>
+              </w:rPr>
+              <w:tab/>
+            </w:r>
+            <w:r>
+              <w:rPr>
+                <w:noProof/>
+                <w:webHidden/>
+              </w:rPr>
+              <w:fldChar w:fldCharType="begin"/>
+            </w:r>
+            <w:r>
+              <w:rPr>
+                <w:noProof/>
+                <w:webHidden/>
+              </w:rPr>
+              <w:instrText xml:space="preserve"> PAGEREF _Toc235569384 \h </w:instrText>
+            </w:r>
+            <w:r>
+              <w:rPr>
+                <w:noProof/>
+                <w:webHidden/>
+              </w:rPr>
+            </w:r>
+            <w:r>
+              <w:rPr>
+                <w:noProof/>
+                <w:webHidden/>
+              </w:rPr>
+              <w:fldChar w:fldCharType="separate"/>
+            </w:r>
+            <w:r>
+              <w:rPr>
+                <w:noProof/>
+                <w:webHidden/>
+              </w:rPr>
+              <w:t>7</w:t>
+            </w:r>
+            <w:r>
+              <w:rPr>
+                <w:noProof/>
+                <w:webHidden/>
+              </w:rPr>
+              <w:fldChar w:fldCharType="end"/>
+            </w:r>
+          </w:hyperlink>
+        </w:p>
+        <w:p>
+          <w:pPr>
+            <w:pStyle w:val="TOC3"/>
+            <w:tabs>
+              <w:tab w:val="right" w:leader="dot" w:pos="9350"/>
+            </w:tabs>
+            <w:rPr>
+              <w:noProof/>
+            </w:rPr>
+          </w:pPr>
+          <w:hyperlink w:anchor="_Toc235569385" w:history="1">
+            <w:r>
+              <w:rPr>
+                <w:rStyle w:val="Hyperlink"/>
+                <w:noProof/>
+              </w:rPr>
+              <w:t>COMPUTER SCIENCE IN CONTEXT</w:t>
+            </w:r>
+            <w:r>
+              <w:rPr>
+                <w:noProof/>
+                <w:webHidden/>
+              </w:rPr>
+              <w:tab/>
+            </w:r>
+            <w:r>
+              <w:rPr>
+                <w:noProof/>
+                <w:webHidden/>
+              </w:rPr>
+              <w:fldChar w:fldCharType="begin"/>
+            </w:r>
+            <w:r>
+              <w:rPr>
+                <w:noProof/>
+                <w:webHidden/>
+              </w:rPr>
+              <w:instrText xml:space="preserve"> PAGEREF _Toc235569385 \h </w:instrText>
+            </w:r>
+            <w:r>
+              <w:rPr>
+                <w:noProof/>
+                <w:webHidden/>
+              </w:rPr>
+            </w:r>
+            <w:r>
+              <w:rPr>
+                <w:noProof/>
+                <w:webHidden/>
+              </w:rPr>
+              <w:fldChar w:fldCharType="separate"/>
+            </w:r>
+            <w:r>
+              <w:rPr>
+                <w:noProof/>
+                <w:webHidden/>
+              </w:rPr>
+              <w:t>7</w:t>
+            </w:r>
+            <w:r>
+              <w:rPr>
+                <w:noProof/>
+                <w:webHidden/>
+              </w:rPr>
+              <w:fldChar w:fldCharType="end"/>
+            </w:r>
+          </w:hyperlink>
+        </w:p>
+        <w:p>
+          <w:pPr>
+            <w:pStyle w:val="TOC2"/>
+            <w:tabs>
+              <w:tab w:val="right" w:leader="dot" w:pos="9350"/>
+            </w:tabs>
+            <w:rPr>
+              <w:noProof/>
+            </w:rPr>
+          </w:pPr>
+          <w:hyperlink w:anchor="_Toc235569386" w:history="1">
+            <w:r>
+              <w:rPr>
+                <w:rStyle w:val="Hyperlink"/>
+                <w:noProof/>
+              </w:rPr>
+              <w:t>Questions</w:t>
+            </w:r>
+            <w:r>
+              <w:rPr>
+                <w:noProof/>
+                <w:webHidden/>
+              </w:rPr>
+              <w:tab/>
+            </w:r>
+            <w:r>
+              <w:rPr>
+                <w:noProof/>
+                <w:webHidden/>
+              </w:rPr>
+              <w:fldChar w:fldCharType="begin"/>
+            </w:r>
+            <w:r>
+              <w:rPr>
+                <w:noProof/>
+                <w:webHidden/>
+              </w:rPr>
+              <w:instrText xml:space="preserve"> PAGEREF _Toc235569386 \h </w:instrText>
+            </w:r>
+            <w:r>
+              <w:rPr>
+                <w:noProof/>
+                <w:webHidden/>
+              </w:rPr>
+            </w:r>
+            <w:r>
+              <w:rPr>
+                <w:noProof/>
+                <w:webHidden/>
+              </w:rPr>
+              <w:fldChar w:fldCharType="separate"/>
+            </w:r>
+            <w:r>
+              <w:rPr>
+                <w:noProof/>
+                <w:webHidden/>
+              </w:rPr>
+              <w:t>7</w:t>
+            </w:r>
+            <w:r>
+              <w:rPr>
+                <w:noProof/>
+                <w:webHidden/>
+              </w:rPr>
+              <w:fldChar w:fldCharType="end"/>
+            </w:r>
+          </w:hyperlink>
+        </w:p>
+        <w:p>
+          <w:pPr>
+            <w:pStyle w:val="TOC1"/>
+            <w:tabs>
+              <w:tab w:val="right" w:leader="dot" w:pos="9350"/>
+            </w:tabs>
+            <w:rPr>
+              <w:noProof/>
+            </w:rPr>
+          </w:pPr>
+          <w:hyperlink w:anchor="_Toc235569387" w:history="1">
+            <w:r>
+              <w:rPr>
+                <w:rStyle w:val="Hyperlink"/>
+                <w:noProof/>
+              </w:rPr>
+              <w:t>2.5 Detecting Errors in Data Transmission</w:t>
+            </w:r>
+            <w:r>
+              <w:rPr>
+                <w:noProof/>
+                <w:webHidden/>
+              </w:rPr>
+              <w:tab/>
+            </w:r>
+            <w:r>
+              <w:rPr>
+                <w:noProof/>
+                <w:webHidden/>
+              </w:rPr>
+              <w:fldChar w:fldCharType="begin"/>
+            </w:r>
+            <w:r>
+              <w:rPr>
+                <w:noProof/>
+                <w:webHidden/>
+              </w:rPr>
+              <w:instrText xml:space="preserve"> PAGEREF _Toc235569387 \h </w:instrText>
+            </w:r>
+            <w:r>
+              <w:rPr>
+                <w:noProof/>
+                <w:webHidden/>
+              </w:rPr>
+            </w:r>
+            <w:r>
+              <w:rPr>
+                <w:noProof/>
+                <w:webHidden/>
+              </w:rPr>
+              <w:fldChar w:fldCharType="separate"/>
+            </w:r>
+            <w:r>
+              <w:rPr>
+                <w:noProof/>
+                <w:webHidden/>
+              </w:rPr>
+              <w:t>8</w:t>
+            </w:r>
+            <w:r>
+              <w:rPr>
+                <w:noProof/>
+                <w:webHidden/>
+              </w:rPr>
+              <w:fldChar w:fldCharType="end"/>
+            </w:r>
+          </w:hyperlink>
+        </w:p>
+        <w:p>
+          <w:pPr>
+            <w:pStyle w:val="TOC2"/>
+            <w:tabs>
+              <w:tab w:val="right" w:leader="dot" w:pos="9350"/>
+            </w:tabs>
+            <w:rPr>
+              <w:noProof/>
+            </w:rPr>
+          </w:pPr>
+          <w:hyperlink w:anchor="_Toc235569388" w:history="1">
+            <w:r>
+              <w:rPr>
+                <w:rStyle w:val="Hyperlink"/>
+                <w:noProof/>
+              </w:rPr>
+              <w:t>Questions</w:t>
+            </w:r>
+            <w:r>
+              <w:rPr>
+                <w:noProof/>
+                <w:webHidden/>
+              </w:rPr>
+              <w:tab/>
+            </w:r>
+            <w:r>
+              <w:rPr>
+                <w:noProof/>
+                <w:webHidden/>
+              </w:rPr>
+              <w:fldChar w:fldCharType="begin"/>
+            </w:r>
+            <w:r>
+              <w:rPr>
+                <w:noProof/>
+                <w:webHidden/>
+              </w:rPr>
+              <w:instrText xml:space="preserve"> PAGEREF _Toc235569388 \h </w:instrText>
+            </w:r>
+            <w:r>
+              <w:rPr>
+                <w:noProof/>
+                <w:webHidden/>
+              </w:rPr>
+            </w:r>
+            <w:r>
+              <w:rPr>
+                <w:noProof/>
+                <w:webHidden/>
+              </w:rPr>
+              <w:fldChar w:fldCharType="separate"/>
+            </w:r>
+            <w:r>
+              <w:rPr>
+                <w:noProof/>
+                <w:webHidden/>
+              </w:rPr>
+              <w:t>8</w:t>
+            </w:r>
+            <w:r>
+              <w:rPr>
+                <w:noProof/>
+                <w:webHidden/>
+              </w:rPr>
+              <w:fldChar w:fldCharType="end"/>
+            </w:r>
+          </w:hyperlink>
+        </w:p>
+        <w:p>
+          <w:pPr>
+            <w:pStyle w:val="TOC2"/>
+            <w:tabs>
+              <w:tab w:val="right" w:leader="dot" w:pos="9350"/>
+            </w:tabs>
+            <w:rPr>
+              <w:noProof/>
+            </w:rPr>
+          </w:pPr>
+          <w:hyperlink w:anchor="_Toc235569389" w:history="1">
+            <w:r>
+              <w:rPr>
+                <w:rStyle w:val="Hyperlink"/>
+                <w:noProof/>
+              </w:rPr>
+              <w:t>Activity 2.7</w:t>
+            </w:r>
+            <w:r>
+              <w:rPr>
+                <w:noProof/>
+                <w:webHidden/>
+              </w:rPr>
+              <w:tab/>
+            </w:r>
+            <w:r>
+              <w:rPr>
+                <w:noProof/>
+                <w:webHidden/>
+              </w:rPr>
+              <w:fldChar w:fldCharType="begin"/>
+            </w:r>
+            <w:r>
+              <w:rPr>
+                <w:noProof/>
+                <w:webHidden/>
+              </w:rPr>
+              <w:instrText xml:space="preserve"> PAGEREF _Toc235569389 \h </w:instrText>
+            </w:r>
+            <w:r>
+              <w:rPr>
+                <w:noProof/>
+                <w:webHidden/>
+              </w:rPr>
+            </w:r>
+            <w:r>
+              <w:rPr>
+                <w:noProof/>
+                <w:webHidden/>
+              </w:rPr>
+              <w:fldChar w:fldCharType="separate"/>
+            </w:r>
+            <w:r>
+              <w:rPr>
+                <w:noProof/>
+                <w:webHidden/>
+              </w:rPr>
+              <w:t>9</w:t>
+            </w:r>
+            <w:r>
+              <w:rPr>
+                <w:noProof/>
+                <w:webHidden/>
+              </w:rPr>
+              <w:fldChar w:fldCharType="end"/>
+            </w:r>
+          </w:hyperlink>
+        </w:p>
+        <w:p>
+          <w:pPr>
+            <w:pStyle w:val="TOC2"/>
+            <w:tabs>
+              <w:tab w:val="right" w:leader="dot" w:pos="9350"/>
+            </w:tabs>
+            <w:rPr>
+              <w:noProof/>
+            </w:rPr>
+          </w:pPr>
+          <w:hyperlink w:anchor="_Toc235569390" w:history="1">
+            <w:r>
+              <w:rPr>
+                <w:rStyle w:val="Hyperlink"/>
+                <w:noProof/>
+              </w:rPr>
+              <w:t>Activity 2.8</w:t>
+            </w:r>
+            <w:r>
+              <w:rPr>
+                <w:noProof/>
+                <w:webHidden/>
+              </w:rPr>
+              <w:tab/>
+            </w:r>
+            <w:r>
+              <w:rPr>
+                <w:noProof/>
+                <w:webHidden/>
+              </w:rPr>
+              <w:fldChar w:fldCharType="begin"/>
+            </w:r>
+            <w:r>
+              <w:rPr>
+                <w:noProof/>
+                <w:webHidden/>
+              </w:rPr>
+              <w:instrText xml:space="preserve"> PAGEREF _Toc235569390 \h </w:instrText>
+            </w:r>
+            <w:r>
+              <w:rPr>
+                <w:noProof/>
+                <w:webHidden/>
+              </w:rPr>
+            </w:r>
+            <w:r>
+              <w:rPr>
+                <w:noProof/>
+                <w:webHidden/>
+              </w:rPr>
+              <w:fldChar w:fldCharType="separate"/>
+            </w:r>
+            <w:r>
+              <w:rPr>
+                <w:noProof/>
+                <w:webHidden/>
+              </w:rPr>
+              <w:t>10</w:t>
+            </w:r>
+            <w:r>
+              <w:rPr>
+                <w:noProof/>
+                <w:webHidden/>
+              </w:rPr>
+              <w:fldChar w:fldCharType="end"/>
+            </w:r>
+          </w:hyperlink>
+        </w:p>
+        <w:p>
+          <w:pPr>
+            <w:pStyle w:val="TOC2"/>
+            <w:tabs>
+              <w:tab w:val="right" w:leader="dot" w:pos="9350"/>
+            </w:tabs>
+            <w:rPr>
+              <w:noProof/>
+            </w:rPr>
+          </w:pPr>
+          <w:hyperlink w:anchor="_Toc235569391" w:history="1">
+            <w:r>
+              <w:rPr>
+                <w:rStyle w:val="Hyperlink"/>
+                <w:noProof/>
+              </w:rPr>
+              <w:t>Activity 2.9</w:t>
+            </w:r>
+            <w:r>
+              <w:rPr>
+                <w:noProof/>
+                <w:webHidden/>
+              </w:rPr>
+              <w:tab/>
+            </w:r>
+            <w:r>
+              <w:rPr>
+                <w:noProof/>
+                <w:webHidden/>
+              </w:rPr>
+              <w:fldChar w:fldCharType="begin"/>
+            </w:r>
+            <w:r>
+              <w:rPr>
+                <w:noProof/>
+                <w:webHidden/>
+              </w:rPr>
+              <w:instrText xml:space="preserve"> PAGEREF _Toc235569391 \h </w:instrText>
+            </w:r>
+            <w:r>
+              <w:rPr>
+                <w:noProof/>
+                <w:webHidden/>
+              </w:rPr>
+            </w:r>
+            <w:r>
+              <w:rPr>
+                <w:noProof/>
+                <w:webHidden/>
+              </w:rPr>
+              <w:fldChar w:fldCharType="separate"/>
+            </w:r>
+            <w:r>
+              <w:rPr>
+                <w:noProof/>
+                <w:webHidden/>
+              </w:rPr>
+              <w:t>10</w:t>
+            </w:r>
+            <w:r>
+              <w:rPr>
+                <w:noProof/>
+                <w:webHidden/>
+              </w:rPr>
+              <w:fldChar w:fldCharType="end"/>
+            </w:r>
+          </w:hyperlink>
+        </w:p>
+        <w:p>
+          <w:pPr>
+            <w:pStyle w:val="TOC2"/>
+            <w:tabs>
+              <w:tab w:val="right" w:leader="dot" w:pos="9350"/>
+            </w:tabs>
+            <w:rPr>
+              <w:noProof/>
+            </w:rPr>
+          </w:pPr>
+          <w:hyperlink w:anchor="_Toc235569392" w:history="1">
+            <w:r>
+              <w:rPr>
+                <w:rStyle w:val="Hyperlink"/>
+                <w:noProof/>
+              </w:rPr>
+              <w:t>Activity 2.10</w:t>
+            </w:r>
+            <w:r>
+              <w:rPr>
+                <w:noProof/>
+                <w:webHidden/>
+              </w:rPr>
+              <w:tab/>
+            </w:r>
+            <w:r>
+              <w:rPr>
+                <w:noProof/>
+                <w:webHidden/>
+              </w:rPr>
+              <w:fldChar w:fldCharType="begin"/>
+            </w:r>
+            <w:r>
+              <w:rPr>
+                <w:noProof/>
+                <w:webHidden/>
+              </w:rPr>
+              <w:instrText xml:space="preserve"> PAGEREF _Toc235569392 \h </w:instrText>
+            </w:r>
+            <w:r>
+              <w:rPr>
+                <w:noProof/>
+                <w:webHidden/>
+              </w:rPr>
+            </w:r>
+            <w:r>
+              <w:rPr>
+                <w:noProof/>
+                <w:webHidden/>
+              </w:rPr>
+              <w:fldChar w:fldCharType="separate"/>
+            </w:r>
+            <w:r>
+              <w:rPr>
+                <w:noProof/>
+                <w:webHidden/>
+              </w:rPr>
+              <w:t>11</w:t>
+            </w:r>
+            <w:r>
+              <w:rPr>
+                <w:noProof/>
+                <w:webHidden/>
+              </w:rPr>
+              <w:fldChar w:fldCharType="end"/>
+            </w:r>
+          </w:hyperlink>
+        </w:p>
+        <w:p>
+          <w:pPr>
+            <w:pStyle w:val="TOC3"/>
+            <w:tabs>
+              <w:tab w:val="right" w:leader="dot" w:pos="9350"/>
+            </w:tabs>
+            <w:rPr>
+              <w:noProof/>
+            </w:rPr>
+          </w:pPr>
+          <w:hyperlink w:anchor="_Toc235569393" w:history="1">
+            <w:r>
+              <w:rPr>
+                <w:rStyle w:val="Hyperlink"/>
+                <w:noProof/>
+              </w:rPr>
+              <w:t>COMPUTER SCIENCE IN CONTEXT</w:t>
+            </w:r>
+            <w:r>
+              <w:rPr>
+                <w:noProof/>
+                <w:webHidden/>
+              </w:rPr>
+              <w:tab/>
+            </w:r>
+            <w:r>
+              <w:rPr>
+                <w:noProof/>
+                <w:webHidden/>
+              </w:rPr>
+              <w:fldChar w:fldCharType="begin"/>
+            </w:r>
+            <w:r>
+              <w:rPr>
+                <w:noProof/>
+                <w:webHidden/>
+              </w:rPr>
+              <w:instrText xml:space="preserve"> PAGEREF _Toc235569393 \h </w:instrText>
+            </w:r>
+            <w:r>
+              <w:rPr>
+                <w:noProof/>
+                <w:webHidden/>
+              </w:rPr>
+            </w:r>
+            <w:r>
+              <w:rPr>
+                <w:noProof/>
+                <w:webHidden/>
+              </w:rPr>
+              <w:fldChar w:fldCharType="separate"/>
+            </w:r>
+            <w:r>
+              <w:rPr>
+                <w:noProof/>
+                <w:webHidden/>
+              </w:rPr>
+              <w:t>11</w:t>
+            </w:r>
+            <w:r>
+              <w:rPr>
+                <w:noProof/>
+                <w:webHidden/>
+              </w:rPr>
+              <w:fldChar w:fldCharType="end"/>
+            </w:r>
+          </w:hyperlink>
+        </w:p>
+        <w:p>
+          <w:pPr>
+            <w:pStyle w:val="TOC1"/>
+            <w:tabs>
+              <w:tab w:val="right" w:leader="dot" w:pos="9350"/>
+            </w:tabs>
+            <w:rPr>
+              <w:noProof/>
+            </w:rPr>
+          </w:pPr>
+          <w:hyperlink w:anchor="_Toc235569394" w:history="1">
+            <w:r>
+              <w:rPr>
+                <w:rStyle w:val="Hyperlink"/>
+                <w:noProof/>
+              </w:rPr>
+              <w:t>2.6 Encryption</w:t>
+            </w:r>
+            <w:r>
+              <w:rPr>
+                <w:noProof/>
+                <w:webHidden/>
+              </w:rPr>
+              <w:tab/>
+            </w:r>
+            <w:r>
+              <w:rPr>
+                <w:noProof/>
+                <w:webHidden/>
+              </w:rPr>
+              <w:fldChar w:fldCharType="begin"/>
+            </w:r>
+            <w:r>
+              <w:rPr>
+                <w:noProof/>
+                <w:webHidden/>
+              </w:rPr>
+              <w:instrText xml:space="preserve"> PAGEREF _Toc235569394 \h </w:instrText>
+            </w:r>
+            <w:r>
+              <w:rPr>
+                <w:noProof/>
+                <w:webHidden/>
+              </w:rPr>
+            </w:r>
+            <w:r>
+              <w:rPr>
+                <w:noProof/>
+                <w:webHidden/>
+              </w:rPr>
+              <w:fldChar w:fldCharType="separate"/>
+            </w:r>
+            <w:r>
+              <w:rPr>
+                <w:noProof/>
+                <w:webHidden/>
+              </w:rPr>
+              <w:t>11</w:t>
+            </w:r>
+            <w:r>
+              <w:rPr>
+                <w:noProof/>
+                <w:webHidden/>
+              </w:rPr>
+              <w:fldChar w:fldCharType="end"/>
+            </w:r>
+          </w:hyperlink>
+        </w:p>
+        <w:p>
+          <w:pPr>
+            <w:pStyle w:val="TOC2"/>
+            <w:tabs>
+              <w:tab w:val="right" w:leader="dot" w:pos="9350"/>
+            </w:tabs>
+            <w:rPr>
+              <w:noProof/>
+            </w:rPr>
+          </w:pPr>
+          <w:hyperlink w:anchor="_Toc235569395" w:history="1">
+            <w:r>
+              <w:rPr>
+                <w:rStyle w:val="Hyperlink"/>
+                <w:noProof/>
+              </w:rPr>
+              <w:t>Questions</w:t>
+            </w:r>
+            <w:r>
+              <w:rPr>
+                <w:noProof/>
+                <w:webHidden/>
+              </w:rPr>
+              <w:tab/>
+            </w:r>
+            <w:r>
+              <w:rPr>
+                <w:noProof/>
+                <w:webHidden/>
+              </w:rPr>
+              <w:fldChar w:fldCharType="begin"/>
+            </w:r>
+            <w:r>
+              <w:rPr>
+                <w:noProof/>
+                <w:webHidden/>
+              </w:rPr>
+              <w:instrText xml:space="preserve"> PAGEREF _Toc235569395 \h </w:instrText>
+            </w:r>
+            <w:r>
+              <w:rPr>
+                <w:noProof/>
+                <w:webHidden/>
+              </w:rPr>
+            </w:r>
+            <w:r>
+              <w:rPr>
+                <w:noProof/>
+                <w:webHidden/>
+              </w:rPr>
+              <w:fldChar w:fldCharType="separate"/>
+            </w:r>
+            <w:r>
+              <w:rPr>
+                <w:noProof/>
+                <w:webHidden/>
+              </w:rPr>
+              <w:t>11</w:t>
+            </w:r>
+            <w:r>
+              <w:rPr>
+                <w:noProof/>
+                <w:webHidden/>
+              </w:rPr>
+              <w:fldChar w:fldCharType="end"/>
+            </w:r>
+          </w:hyperlink>
+        </w:p>
+        <w:p>
+          <w:pPr>
+            <w:pStyle w:val="TOC3"/>
+            <w:tabs>
+              <w:tab w:val="right" w:leader="dot" w:pos="9350"/>
+            </w:tabs>
+            <w:rPr>
+              <w:noProof/>
+            </w:rPr>
+          </w:pPr>
+          <w:hyperlink w:anchor="_Toc235569396" w:history="1">
+            <w:r>
+              <w:rPr>
+                <w:rStyle w:val="Hyperlink"/>
+                <w:noProof/>
+              </w:rPr>
+              <w:t>COMPUTER SCIENCE IN CONTEXT</w:t>
+            </w:r>
+            <w:r>
+              <w:rPr>
+                <w:noProof/>
+                <w:webHidden/>
+              </w:rPr>
+              <w:tab/>
+            </w:r>
+            <w:r>
+              <w:rPr>
+                <w:noProof/>
+                <w:webHidden/>
+              </w:rPr>
+              <w:fldChar w:fldCharType="begin"/>
+            </w:r>
+            <w:r>
+              <w:rPr>
+                <w:noProof/>
+                <w:webHidden/>
+              </w:rPr>
+              <w:instrText xml:space="preserve"> PAGEREF _Toc235569396 \h </w:instrText>
+            </w:r>
+            <w:r>
+              <w:rPr>
+                <w:noProof/>
+                <w:webHidden/>
+              </w:rPr>
+            </w:r>
+            <w:r>
+              <w:rPr>
+                <w:noProof/>
+                <w:webHidden/>
+              </w:rPr>
+              <w:fldChar w:fldCharType="separate"/>
+            </w:r>
+            <w:r>
+              <w:rPr>
+                <w:noProof/>
+                <w:webHidden/>
+              </w:rPr>
+              <w:t>12</w:t>
+            </w:r>
+            <w:r>
+              <w:rPr>
+                <w:noProof/>
+                <w:webHidden/>
+              </w:rPr>
+              <w:fldChar w:fldCharType="end"/>
+            </w:r>
+          </w:hyperlink>
+        </w:p>
+        <w:p>
+          <w:r>
+            <w:rPr>
+              <w:b/>
+              <w:bCs/>
+              <w:noProof/>
+            </w:rPr>
+            <w:fldChar w:fldCharType="end"/>
+          </w:r>
+        </w:p>
+      </w:sdtContent>
+    </w:sdt>
+    <w:p>
+      <w:r>
+        <w:br w:type="column"/>
+      </w:r>
+      <w:r>
+        <w:lastRenderedPageBreak/>
         <w:t>Getting Started:</w:t>
       </w:r>
     </w:p>
@@ -622,17 +2375,21 @@
       <w:pPr>
         <w:pStyle w:val="Heading1"/>
       </w:pPr>
+      <w:bookmarkStart w:id="0" w:name="_Toc235569372"/>
       <w:r>
         <w:t>2.1 The structure of a data packet</w:t>
       </w:r>
+      <w:bookmarkEnd w:id="0"/>
     </w:p>
     <w:p>
       <w:pPr>
         <w:pStyle w:val="Heading2"/>
       </w:pPr>
+      <w:bookmarkStart w:id="1" w:name="_Toc235569373"/>
       <w:r>
         <w:t>Questions</w:t>
       </w:r>
+      <w:bookmarkEnd w:id="1"/>
     </w:p>
     <w:p>
       <w:r>
@@ -857,9 +2614,11 @@
       <w:pPr>
         <w:pStyle w:val="Heading2"/>
       </w:pPr>
+      <w:bookmarkStart w:id="2" w:name="_Toc235569374"/>
       <w:r>
         <w:t>Activity 2.1</w:t>
       </w:r>
+      <w:bookmarkEnd w:id="2"/>
     </w:p>
     <w:p>
       <w:r>
@@ -936,20 +2695,24 @@
       <w:pPr>
         <w:pStyle w:val="Heading1"/>
       </w:pPr>
+      <w:bookmarkStart w:id="3" w:name="_Toc235569375"/>
       <w:r>
         <w:t xml:space="preserve">2.2 Packet </w:t>
       </w:r>
       <w:r>
         <w:t>Switching</w:t>
       </w:r>
+      <w:bookmarkEnd w:id="3"/>
     </w:p>
     <w:p>
       <w:pPr>
         <w:pStyle w:val="Heading2"/>
       </w:pPr>
+      <w:bookmarkStart w:id="4" w:name="_Toc235569376"/>
       <w:r>
         <w:t>Activity 2.2</w:t>
       </w:r>
+      <w:bookmarkEnd w:id="4"/>
     </w:p>
     <w:p>
       <w:r>
@@ -1380,7 +3143,7 @@
           </mc:Choice>
           <mc:Fallback>
             <w:pict>
-              <v:shape w14:anchorId="5586D292" id="Straight Arrow Connector 13" o:spid="_x0000_s1026" type="#_x0000_t32" style="position:absolute;margin-left:320pt;margin-top:528pt;width:37.5pt;height:30.5pt;z-index:251656192;visibility:visible;mso-wrap-style:square;mso-width-percent:0;mso-height-percent:0;mso-wrap-distance-left:9pt;mso-wrap-distance-top:0;mso-wrap-distance-right:9pt;mso-wrap-distance-bottom:0;mso-position-horizontal:absolute;mso-position-horizontal-relative:page;mso-position-vertical:absolute;mso-position-vertical-relative:page;mso-width-percent:0;mso-height-percent:0;mso-width-relative:margin;mso-height-relative:margin" o:gfxdata="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" strokecolor="#c0504d [3205]" strokeweight="3pt">
+              <v:shape w14:anchorId="3DE4EAA4" id="Straight Arrow Connector 13" o:spid="_x0000_s1026" type="#_x0000_t32" style="position:absolute;margin-left:320pt;margin-top:528pt;width:37.5pt;height:30.5pt;z-index:251656192;visibility:visible;mso-wrap-style:square;mso-width-percent:0;mso-height-percent:0;mso-wrap-distance-left:9pt;mso-wrap-distance-top:0;mso-wrap-distance-right:9pt;mso-wrap-distance-bottom:0;mso-position-horizontal:absolute;mso-position-horizontal-relative:page;mso-position-vertical:absolute;mso-position-vertical-relative:page;mso-width-percent:0;mso-height-percent:0;mso-width-relative:margin;mso-height-relative:margin" o:gfxdata="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" strokecolor="#c0504d [3205]" strokeweight="3pt">
                 <v:stroke endarrow="block"/>
                 <v:shadow on="t" color="black" opacity="22937f" origin=",.5" offset="0,.63889mm"/>
                 <w10:wrap anchorx="page" anchory="page"/>
@@ -1454,7 +3217,7 @@
           </mc:Choice>
           <mc:Fallback>
             <w:pict>
-              <v:shape w14:anchorId="60A26E48" id="Straight Arrow Connector 13" o:spid="_x0000_s1026" type="#_x0000_t32" style="position:absolute;margin-left:168.5pt;margin-top:521.4pt;width:85.5pt;height:3.6pt;z-index:251655168;visibility:visible;mso-wrap-style:square;mso-width-percent:0;mso-height-percent:0;mso-wrap-distance-left:9pt;mso-wrap-distance-top:0;mso-wrap-distance-right:9pt;mso-wrap-distance-bottom:0;mso-position-horizontal:absolute;mso-position-horizontal-relative:page;mso-position-vertical:absolute;mso-position-vertical-relative:page;mso-width-percent:0;mso-height-percent:0;mso-width-relative:margin;mso-height-relative:margin" o:gfxdata="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" strokecolor="#c0504d [3205]" strokeweight="3pt">
+              <v:shape w14:anchorId="5ADDCB8F" id="Straight Arrow Connector 13" o:spid="_x0000_s1026" type="#_x0000_t32" style="position:absolute;margin-left:168.5pt;margin-top:521.4pt;width:85.5pt;height:3.6pt;z-index:251655168;visibility:visible;mso-wrap-style:square;mso-width-percent:0;mso-height-percent:0;mso-wrap-distance-left:9pt;mso-wrap-distance-top:0;mso-wrap-distance-right:9pt;mso-wrap-distance-bottom:0;mso-position-horizontal:absolute;mso-position-horizontal-relative:page;mso-position-vertical:absolute;mso-position-vertical-relative:page;mso-width-percent:0;mso-height-percent:0;mso-width-relative:margin;mso-height-relative:margin" o:gfxdata="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" strokecolor="#c0504d [3205]" strokeweight="3pt">
                 <v:stroke endarrow="block"/>
                 <v:shadow on="t" color="black" opacity="22937f" origin=",.5" offset="0,.63889mm"/>
                 <w10:wrap anchorx="page" anchory="page"/>
@@ -1522,7 +3285,7 @@
           </mc:Choice>
           <mc:Fallback>
             <w:pict>
-              <v:shape w14:anchorId="28F86580" id="Straight Arrow Connector 11" o:spid="_x0000_s1026" type="#_x0000_t32" style="position:absolute;margin-left:78.5pt;margin-top:539pt;width:30pt;height:52.5pt;flip:y;z-index:251637760;visibility:visible;mso-wrap-style:square;mso-wrap-distance-left:9pt;mso-wrap-distance-top:0;mso-wrap-distance-right:9pt;mso-wrap-distance-bottom:0;mso-position-horizontal:absolute;mso-position-horizontal-relative:page;mso-position-vertical:absolute;mso-position-vertical-relative:page" o:gfxdata="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" strokecolor="#4579b8 [3044]">
+              <v:shape w14:anchorId="3140B083" id="Straight Arrow Connector 11" o:spid="_x0000_s1026" type="#_x0000_t32" style="position:absolute;margin-left:78.5pt;margin-top:539pt;width:30pt;height:52.5pt;flip:y;z-index:251637760;visibility:visible;mso-wrap-style:square;mso-wrap-distance-left:9pt;mso-wrap-distance-top:0;mso-wrap-distance-right:9pt;mso-wrap-distance-bottom:0;mso-position-horizontal:absolute;mso-position-horizontal-relative:page;mso-position-vertical:absolute;mso-position-vertical-relative:page" o:gfxdata="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" strokecolor="#4579b8 [3044]">
                 <v:stroke endarrow="block"/>
                 <w10:wrap anchorx="page" anchory="page"/>
               </v:shape>
@@ -1725,7 +3488,7 @@
           </mc:Choice>
           <mc:Fallback>
             <w:pict>
-              <v:shape w14:anchorId="4F0D330A" id="Straight Arrow Connector 13" o:spid="_x0000_s1026" type="#_x0000_t32" style="position:absolute;margin-left:307pt;margin-top:544.5pt;width:3.6pt;height:45pt;z-index:251660288;visibility:visible;mso-wrap-style:square;mso-width-percent:0;mso-height-percent:0;mso-wrap-distance-left:9pt;mso-wrap-distance-top:0;mso-wrap-distance-right:9pt;mso-wrap-distance-bottom:0;mso-position-horizontal:absolute;mso-position-horizontal-relative:page;mso-position-vertical:absolute;mso-position-vertical-relative:page;mso-width-percent:0;mso-height-percent:0;mso-width-relative:margin;mso-height-relative:margin" o:gfxdata="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" strokecolor="#9bbb59 [3206]" strokeweight="3pt">
+              <v:shape w14:anchorId="7654BB10" id="Straight Arrow Connector 13" o:spid="_x0000_s1026" type="#_x0000_t32" style="position:absolute;margin-left:307pt;margin-top:544.5pt;width:3.6pt;height:45pt;z-index:251660288;visibility:visible;mso-wrap-style:square;mso-width-percent:0;mso-height-percent:0;mso-wrap-distance-left:9pt;mso-wrap-distance-top:0;mso-wrap-distance-right:9pt;mso-wrap-distance-bottom:0;mso-position-horizontal:absolute;mso-position-horizontal-relative:page;mso-position-vertical:absolute;mso-position-vertical-relative:page;mso-width-percent:0;mso-height-percent:0;mso-width-relative:margin;mso-height-relative:margin" o:gfxdata="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" strokecolor="#9bbb59 [3206]" strokeweight="3pt">
                 <v:stroke endarrow="block"/>
                 <v:shadow on="t" color="black" opacity="22937f" origin=",.5" offset="0,.63889mm"/>
                 <w10:wrap anchorx="page" anchory="page"/>
@@ -1799,7 +3562,7 @@
           </mc:Choice>
           <mc:Fallback>
             <w:pict>
-              <v:shape w14:anchorId="3C913D17" id="Straight Arrow Connector 13" o:spid="_x0000_s1026" type="#_x0000_t32" style="position:absolute;margin-left:168.5pt;margin-top:543pt;width:98pt;height:160pt;flip:y;z-index:251676672;visibility:visible;mso-wrap-style:square;mso-width-percent:0;mso-height-percent:0;mso-wrap-distance-left:9pt;mso-wrap-distance-top:0;mso-wrap-distance-right:9pt;mso-wrap-distance-bottom:0;mso-position-horizontal:absolute;mso-position-horizontal-relative:page;mso-position-vertical:absolute;mso-position-vertical-relative:page;mso-width-percent:0;mso-height-percent:0;mso-width-relative:margin;mso-height-relative:margin" o:gfxdata="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" strokecolor="#9bbb59 [3206]" strokeweight="3pt">
+              <v:shape w14:anchorId="5DE17721" id="Straight Arrow Connector 13" o:spid="_x0000_s1026" type="#_x0000_t32" style="position:absolute;margin-left:168.5pt;margin-top:543pt;width:98pt;height:160pt;flip:y;z-index:251676672;visibility:visible;mso-wrap-style:square;mso-width-percent:0;mso-height-percent:0;mso-wrap-distance-left:9pt;mso-wrap-distance-top:0;mso-wrap-distance-right:9pt;mso-wrap-distance-bottom:0;mso-position-horizontal:absolute;mso-position-horizontal-relative:page;mso-position-vertical:absolute;mso-position-vertical-relative:page;mso-width-percent:0;mso-height-percent:0;mso-width-relative:margin;mso-height-relative:margin" o:gfxdata="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" strokecolor="#9bbb59 [3206]" strokeweight="3pt">
                 <v:stroke endarrow="block"/>
                 <v:shadow on="t" color="black" opacity="22937f" origin=",.5" offset="0,.63889mm"/>
                 <w10:wrap anchorx="page" anchory="page"/>
@@ -1873,7 +3636,7 @@
           </mc:Choice>
           <mc:Fallback>
             <w:pict>
-              <v:shape w14:anchorId="43526176" id="Straight Arrow Connector 13" o:spid="_x0000_s1026" type="#_x0000_t32" style="position:absolute;margin-left:240pt;margin-top:543pt;width:28.5pt;height:125pt;flip:x;z-index:251671552;visibility:visible;mso-wrap-style:square;mso-width-percent:0;mso-height-percent:0;mso-wrap-distance-left:9pt;mso-wrap-distance-top:0;mso-wrap-distance-right:9pt;mso-wrap-distance-bottom:0;mso-position-horizontal:absolute;mso-position-horizontal-relative:page;mso-position-vertical:absolute;mso-position-vertical-relative:page;mso-width-percent:0;mso-height-percent:0;mso-width-relative:margin;mso-height-relative:margin" o:gfxdata="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" strokecolor="#f79646 [3209]" strokeweight="3pt">
+              <v:shape w14:anchorId="25519C81" id="Straight Arrow Connector 13" o:spid="_x0000_s1026" type="#_x0000_t32" style="position:absolute;margin-left:240pt;margin-top:543pt;width:28.5pt;height:125pt;flip:x;z-index:251671552;visibility:visible;mso-wrap-style:square;mso-width-percent:0;mso-height-percent:0;mso-wrap-distance-left:9pt;mso-wrap-distance-top:0;mso-wrap-distance-right:9pt;mso-wrap-distance-bottom:0;mso-position-horizontal:absolute;mso-position-horizontal-relative:page;mso-position-vertical:absolute;mso-position-vertical-relative:page;mso-width-percent:0;mso-height-percent:0;mso-width-relative:margin;mso-height-relative:margin" o:gfxdata="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" strokecolor="#f79646 [3209]" strokeweight="3pt">
                 <v:stroke endarrow="block"/>
                 <v:shadow on="t" color="black" opacity="22937f" origin=",.5" offset="0,.63889mm"/>
                 <w10:wrap anchorx="page" anchory="page"/>
@@ -1941,7 +3704,7 @@
           </mc:Choice>
           <mc:Fallback>
             <w:pict>
-              <v:shape w14:anchorId="39302718" id="Straight Arrow Connector 14" o:spid="_x0000_s1026" type="#_x0000_t32" style="position:absolute;margin-left:167pt;margin-top:544pt;width:102pt;height:121.5pt;flip:y;z-index:251670528;visibility:visible;mso-wrap-style:square;mso-wrap-distance-left:9pt;mso-wrap-distance-top:0;mso-wrap-distance-right:9pt;mso-wrap-distance-bottom:0;mso-position-horizontal:absolute;mso-position-horizontal-relative:page;mso-position-vertical:absolute;mso-position-vertical-relative:page" o:gfxdata="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" strokecolor="#f79646 [3209]" strokeweight="3pt">
+              <v:shape w14:anchorId="3BCC0965" id="Straight Arrow Connector 14" o:spid="_x0000_s1026" type="#_x0000_t32" style="position:absolute;margin-left:167pt;margin-top:544pt;width:102pt;height:121.5pt;flip:y;z-index:251670528;visibility:visible;mso-wrap-style:square;mso-wrap-distance-left:9pt;mso-wrap-distance-top:0;mso-wrap-distance-right:9pt;mso-wrap-distance-bottom:0;mso-position-horizontal:absolute;mso-position-horizontal-relative:page;mso-position-vertical:absolute;mso-position-vertical-relative:page" o:gfxdata="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" strokecolor="#f79646 [3209]" strokeweight="3pt">
                 <v:stroke endarrow="block"/>
                 <v:shadow on="t" color="black" opacity="22937f" origin=",.5" offset="0,.63889mm"/>
                 <w10:wrap anchorx="page" anchory="page"/>
@@ -2015,7 +3778,7 @@
           </mc:Choice>
           <mc:Fallback>
             <w:pict>
-              <v:shape w14:anchorId="62EFACE3" id="Straight Arrow Connector 13" o:spid="_x0000_s1026" type="#_x0000_t32" style="position:absolute;margin-left:283.5pt;margin-top:543pt;width:4.5pt;height:47.5pt;z-index:251668480;visibility:visible;mso-wrap-style:square;mso-width-percent:0;mso-height-percent:0;mso-wrap-distance-left:9pt;mso-wrap-distance-top:0;mso-wrap-distance-right:9pt;mso-wrap-distance-bottom:0;mso-position-horizontal:absolute;mso-position-horizontal-relative:page;mso-position-vertical:absolute;mso-position-vertical-relative:page;mso-width-percent:0;mso-height-percent:0;mso-width-relative:margin;mso-height-relative:margin" o:gfxdata="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" strokecolor="black [3200]" strokeweight="3pt">
+              <v:shape w14:anchorId="09B4E3F0" id="Straight Arrow Connector 13" o:spid="_x0000_s1026" type="#_x0000_t32" style="position:absolute;margin-left:283.5pt;margin-top:543pt;width:4.5pt;height:47.5pt;z-index:251668480;visibility:visible;mso-wrap-style:square;mso-width-percent:0;mso-height-percent:0;mso-wrap-distance-left:9pt;mso-wrap-distance-top:0;mso-wrap-distance-right:9pt;mso-wrap-distance-bottom:0;mso-position-horizontal:absolute;mso-position-horizontal-relative:page;mso-position-vertical:absolute;mso-position-vertical-relative:page;mso-width-percent:0;mso-height-percent:0;mso-width-relative:margin;mso-height-relative:margin" o:gfxdata="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" strokecolor="black [3200]" strokeweight="3pt">
                 <v:stroke endarrow="block"/>
                 <v:shadow on="t" color="black" opacity="22937f" origin=",.5" offset="0,.63889mm"/>
                 <w10:wrap anchorx="page" anchory="page"/>
@@ -2089,7 +3852,7 @@
           </mc:Choice>
           <mc:Fallback>
             <w:pict>
-              <v:shape w14:anchorId="4299C012" id="Straight Arrow Connector 13" o:spid="_x0000_s1026" type="#_x0000_t32" style="position:absolute;margin-left:169pt;margin-top:543pt;width:86pt;height:79.5pt;flip:y;z-index:251666432;visibility:visible;mso-wrap-style:square;mso-width-percent:0;mso-height-percent:0;mso-wrap-distance-left:9pt;mso-wrap-distance-top:0;mso-wrap-distance-right:9pt;mso-wrap-distance-bottom:0;mso-position-horizontal:absolute;mso-position-horizontal-relative:page;mso-position-vertical:absolute;mso-position-vertical-relative:page;mso-width-percent:0;mso-height-percent:0;mso-width-relative:margin;mso-height-relative:margin" o:gfxdata="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" strokecolor="black [3200]" strokeweight="3pt">
+              <v:shape w14:anchorId="51971606" id="Straight Arrow Connector 13" o:spid="_x0000_s1026" type="#_x0000_t32" style="position:absolute;margin-left:169pt;margin-top:543pt;width:86pt;height:79.5pt;flip:y;z-index:251666432;visibility:visible;mso-wrap-style:square;mso-width-percent:0;mso-height-percent:0;mso-wrap-distance-left:9pt;mso-wrap-distance-top:0;mso-wrap-distance-right:9pt;mso-wrap-distance-bottom:0;mso-position-horizontal:absolute;mso-position-horizontal-relative:page;mso-position-vertical:absolute;mso-position-vertical-relative:page;mso-width-percent:0;mso-height-percent:0;mso-width-relative:margin;mso-height-relative:margin" o:gfxdata="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" strokecolor="black [3200]" strokeweight="3pt">
                 <v:stroke endarrow="block"/>
                 <v:shadow on="t" color="black" opacity="22937f" origin=",.5" offset="0,.63889mm"/>
                 <w10:wrap anchorx="page" anchory="page"/>
@@ -2163,7 +3926,7 @@
           </mc:Choice>
           <mc:Fallback>
             <w:pict>
-              <v:shape w14:anchorId="44B337CA" id="Straight Arrow Connector 13" o:spid="_x0000_s1026" type="#_x0000_t32" style="position:absolute;margin-left:168.5pt;margin-top:560pt;width:187.5pt;height:20pt;flip:y;z-index:251659264;visibility:visible;mso-wrap-style:square;mso-width-percent:0;mso-height-percent:0;mso-wrap-distance-left:9pt;mso-wrap-distance-top:0;mso-wrap-distance-right:9pt;mso-wrap-distance-bottom:0;mso-position-horizontal:absolute;mso-position-horizontal-relative:page;mso-position-vertical:absolute;mso-position-vertical-relative:page;mso-width-percent:0;mso-height-percent:0;mso-width-relative:margin;mso-height-relative:margin" o:gfxdata="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" strokecolor="#4f81bd [3204]" strokeweight="3pt">
+              <v:shape w14:anchorId="3661945C" id="Straight Arrow Connector 13" o:spid="_x0000_s1026" type="#_x0000_t32" style="position:absolute;margin-left:168.5pt;margin-top:560pt;width:187.5pt;height:20pt;flip:y;z-index:251659264;visibility:visible;mso-wrap-style:square;mso-width-percent:0;mso-height-percent:0;mso-wrap-distance-left:9pt;mso-wrap-distance-top:0;mso-wrap-distance-right:9pt;mso-wrap-distance-bottom:0;mso-position-horizontal:absolute;mso-position-horizontal-relative:page;mso-position-vertical:absolute;mso-position-vertical-relative:page;mso-width-percent:0;mso-height-percent:0;mso-width-relative:margin;mso-height-relative:margin" o:gfxdata="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" strokecolor="#4f81bd [3204]" strokeweight="3pt">
                 <v:stroke endarrow="block"/>
                 <v:shadow on="t" color="black" opacity="22937f" origin=",.5" offset="0,.63889mm"/>
                 <w10:wrap anchorx="page" anchory="page"/>
@@ -2237,7 +4000,7 @@
           </mc:Choice>
           <mc:Fallback>
             <w:pict>
-              <v:shape w14:anchorId="55AD18B3" id="Straight Arrow Connector 13" o:spid="_x0000_s1026" type="#_x0000_t32" style="position:absolute;margin-left:424pt;margin-top:557pt;width:109.5pt;height:38.5pt;z-index:251657216;visibility:visible;mso-wrap-style:square;mso-width-percent:0;mso-height-percent:0;mso-wrap-distance-left:9pt;mso-wrap-distance-top:0;mso-wrap-distance-right:9pt;mso-wrap-distance-bottom:0;mso-position-horizontal:absolute;mso-position-horizontal-relative:page;mso-position-vertical:absolute;mso-position-vertical-relative:page;mso-width-percent:0;mso-height-percent:0;mso-width-relative:margin;mso-height-relative:margin" o:gfxdata="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" strokecolor="#c0504d [3205]" strokeweight="3pt">
+              <v:shape w14:anchorId="72BA9A17" id="Straight Arrow Connector 13" o:spid="_x0000_s1026" type="#_x0000_t32" style="position:absolute;margin-left:424pt;margin-top:557pt;width:109.5pt;height:38.5pt;z-index:251657216;visibility:visible;mso-wrap-style:square;mso-width-percent:0;mso-height-percent:0;mso-wrap-distance-left:9pt;mso-wrap-distance-top:0;mso-wrap-distance-right:9pt;mso-wrap-distance-bottom:0;mso-position-horizontal:absolute;mso-position-horizontal-relative:page;mso-position-vertical:absolute;mso-position-vertical-relative:page;mso-width-percent:0;mso-height-percent:0;mso-width-relative:margin;mso-height-relative:margin" o:gfxdata="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" strokecolor="#c0504d [3205]" strokeweight="3pt">
                 <v:stroke endarrow="block"/>
                 <v:shadow on="t" color="black" opacity="22937f" origin=",.5" offset="0,.63889mm"/>
                 <w10:wrap anchorx="page" anchory="page"/>
@@ -2464,7 +4227,7 @@
           </mc:Choice>
           <mc:Fallback>
             <w:pict>
-              <v:shape w14:anchorId="068C5A02" id="Straight Arrow Connector 13" o:spid="_x0000_s1026" type="#_x0000_t32" style="position:absolute;margin-left:305pt;margin-top:565.5pt;width:53pt;height:118.5pt;flip:x;z-index:251662336;visibility:visible;mso-wrap-style:square;mso-width-percent:0;mso-height-percent:0;mso-wrap-distance-left:9pt;mso-wrap-distance-top:0;mso-wrap-distance-right:9pt;mso-wrap-distance-bottom:0;mso-position-horizontal:absolute;mso-position-horizontal-relative:page;mso-position-vertical:absolute;mso-position-vertical-relative:page;mso-width-percent:0;mso-height-percent:0;mso-width-relative:margin;mso-height-relative:margin" o:gfxdata="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" strokecolor="#4f81bd [3204]" strokeweight="3pt">
+              <v:shape w14:anchorId="0620462F" id="Straight Arrow Connector 13" o:spid="_x0000_s1026" type="#_x0000_t32" style="position:absolute;margin-left:305pt;margin-top:565.5pt;width:53pt;height:118.5pt;flip:x;z-index:251662336;visibility:visible;mso-wrap-style:square;mso-width-percent:0;mso-height-percent:0;mso-wrap-distance-left:9pt;mso-wrap-distance-top:0;mso-wrap-distance-right:9pt;mso-wrap-distance-bottom:0;mso-position-horizontal:absolute;mso-position-horizontal-relative:page;mso-position-vertical:absolute;mso-position-vertical-relative:page;mso-width-percent:0;mso-height-percent:0;mso-width-relative:margin;mso-height-relative:margin" o:gfxdata="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" strokecolor="#4f81bd [3204]" strokeweight="3pt">
                 <v:stroke endarrow="block"/>
                 <v:shadow on="t" color="black" opacity="22937f" origin=",.5" offset="0,.63889mm"/>
                 <w10:wrap anchorx="page" anchory="page"/>
@@ -2842,7 +4605,7 @@
           </mc:Choice>
           <mc:Fallback>
             <w:pict>
-              <v:shape w14:anchorId="32B8868B" id="Straight Arrow Connector 11" o:spid="_x0000_s1026" type="#_x0000_t32" style="position:absolute;margin-left:78pt;margin-top:574.5pt;width:30.5pt;height:33pt;flip:y;z-index:251638784;visibility:visible;mso-wrap-style:square;mso-width-percent:0;mso-height-percent:0;mso-wrap-distance-left:9pt;mso-wrap-distance-top:0;mso-wrap-distance-right:9pt;mso-wrap-distance-bottom:0;mso-position-horizontal:absolute;mso-position-horizontal-relative:page;mso-position-vertical:absolute;mso-position-vertical-relative:page;mso-width-percent:0;mso-height-percent:0;mso-width-relative:margin;mso-height-relative:margin" o:gfxdata="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" strokecolor="#4579b8 [3044]">
+              <v:shape w14:anchorId="78C450AA" id="Straight Arrow Connector 11" o:spid="_x0000_s1026" type="#_x0000_t32" style="position:absolute;margin-left:78pt;margin-top:574.5pt;width:30.5pt;height:33pt;flip:y;z-index:251638784;visibility:visible;mso-wrap-style:square;mso-width-percent:0;mso-height-percent:0;mso-wrap-distance-left:9pt;mso-wrap-distance-top:0;mso-wrap-distance-right:9pt;mso-wrap-distance-bottom:0;mso-position-horizontal:absolute;mso-position-horizontal-relative:page;mso-position-vertical:absolute;mso-position-vertical-relative:page;mso-width-percent:0;mso-height-percent:0;mso-width-relative:margin;mso-height-relative:margin" o:gfxdata="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" strokecolor="#4579b8 [3044]">
                 <v:stroke endarrow="block"/>
                 <w10:wrap anchorx="page" anchory="page"/>
               </v:shape>
@@ -3172,7 +4935,7 @@
           </mc:Choice>
           <mc:Fallback>
             <w:pict>
-              <v:shape w14:anchorId="66279C74" id="Straight Arrow Connector 13" o:spid="_x0000_s1026" type="#_x0000_t32" style="position:absolute;margin-left:323.5pt;margin-top:599.5pt;width:212pt;height:15pt;z-index:251669504;visibility:visible;mso-wrap-style:square;mso-width-percent:0;mso-height-percent:0;mso-wrap-distance-left:9pt;mso-wrap-distance-top:0;mso-wrap-distance-right:9pt;mso-wrap-distance-bottom:0;mso-position-horizontal:absolute;mso-position-horizontal-relative:page;mso-position-vertical:absolute;mso-position-vertical-relative:page;mso-width-percent:0;mso-height-percent:0;mso-width-relative:margin;mso-height-relative:margin" o:gfxdata="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" strokecolor="black [3200]" strokeweight="3pt">
+              <v:shape w14:anchorId="0DB7B4B3" id="Straight Arrow Connector 13" o:spid="_x0000_s1026" type="#_x0000_t32" style="position:absolute;margin-left:323.5pt;margin-top:599.5pt;width:212pt;height:15pt;z-index:251669504;visibility:visible;mso-wrap-style:square;mso-width-percent:0;mso-height-percent:0;mso-wrap-distance-left:9pt;mso-wrap-distance-top:0;mso-wrap-distance-right:9pt;mso-wrap-distance-bottom:0;mso-position-horizontal:absolute;mso-position-horizontal-relative:page;mso-position-vertical:absolute;mso-position-vertical-relative:page;mso-width-percent:0;mso-height-percent:0;mso-width-relative:margin;mso-height-relative:margin" o:gfxdata="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" strokecolor="black [3200]" strokeweight="3pt">
                 <v:stroke endarrow="block"/>
                 <v:shadow on="t" color="black" opacity="22937f" origin=",.5" offset="0,.63889mm"/>
                 <w10:wrap anchorx="page" anchory="page"/>
@@ -3382,7 +5145,7 @@
           </mc:Choice>
           <mc:Fallback>
             <w:pict>
-              <v:shape w14:anchorId="048F78B6" id="Straight Arrow Connector 13" o:spid="_x0000_s1026" type="#_x0000_t32" style="position:absolute;margin-left:441pt;margin-top:622pt;width:95pt;height:74pt;flip:y;z-index:251678720;visibility:visible;mso-wrap-style:square;mso-width-percent:0;mso-height-percent:0;mso-wrap-distance-left:9pt;mso-wrap-distance-top:0;mso-wrap-distance-right:9pt;mso-wrap-distance-bottom:0;mso-position-horizontal:absolute;mso-position-horizontal-relative:page;mso-position-vertical:absolute;mso-position-vertical-relative:page;mso-width-percent:0;mso-height-percent:0;mso-width-relative:margin;mso-height-relative:margin" o:gfxdata="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" strokecolor="#9bbb59 [3206]" strokeweight="3pt">
+              <v:shape w14:anchorId="093CC655" id="Straight Arrow Connector 13" o:spid="_x0000_s1026" type="#_x0000_t32" style="position:absolute;margin-left:441pt;margin-top:622pt;width:95pt;height:74pt;flip:y;z-index:251678720;visibility:visible;mso-wrap-style:square;mso-width-percent:0;mso-height-percent:0;mso-wrap-distance-left:9pt;mso-wrap-distance-top:0;mso-wrap-distance-right:9pt;mso-wrap-distance-bottom:0;mso-position-horizontal:absolute;mso-position-horizontal-relative:page;mso-position-vertical:absolute;mso-position-vertical-relative:page;mso-width-percent:0;mso-height-percent:0;mso-width-relative:margin;mso-height-relative:margin" o:gfxdata="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" strokecolor="#9bbb59 [3206]" strokeweight="3pt">
                 <v:stroke endarrow="block"/>
                 <v:shadow on="t" color="black" opacity="22937f" origin=",.5" offset="0,.63889mm"/>
                 <w10:wrap anchorx="page" anchory="page"/>
@@ -3456,7 +5219,7 @@
           </mc:Choice>
           <mc:Fallback>
             <w:pict>
-              <v:shape w14:anchorId="50F38221" id="Straight Arrow Connector 13" o:spid="_x0000_s1026" type="#_x0000_t32" style="position:absolute;margin-left:298.5pt;margin-top:619.5pt;width:140.5pt;height:79pt;z-index:251677696;visibility:visible;mso-wrap-style:square;mso-width-percent:0;mso-height-percent:0;mso-wrap-distance-left:9pt;mso-wrap-distance-top:0;mso-wrap-distance-right:9pt;mso-wrap-distance-bottom:0;mso-position-horizontal:absolute;mso-position-horizontal-relative:page;mso-position-vertical:absolute;mso-position-vertical-relative:page;mso-width-percent:0;mso-height-percent:0;mso-width-relative:margin;mso-height-relative:margin" o:gfxdata="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" strokecolor="#9bbb59 [3206]" strokeweight="3pt">
+              <v:shape w14:anchorId="67FA560C" id="Straight Arrow Connector 13" o:spid="_x0000_s1026" type="#_x0000_t32" style="position:absolute;margin-left:298.5pt;margin-top:619.5pt;width:140.5pt;height:79pt;z-index:251677696;visibility:visible;mso-wrap-style:square;mso-width-percent:0;mso-height-percent:0;mso-wrap-distance-left:9pt;mso-wrap-distance-top:0;mso-wrap-distance-right:9pt;mso-wrap-distance-bottom:0;mso-position-horizontal:absolute;mso-position-horizontal-relative:page;mso-position-vertical:absolute;mso-position-vertical-relative:page;mso-width-percent:0;mso-height-percent:0;mso-width-relative:margin;mso-height-relative:margin" o:gfxdata="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" strokecolor="#9bbb59 [3206]" strokeweight="3pt">
                 <v:stroke endarrow="block"/>
                 <v:shadow on="t" color="black" opacity="22937f" origin=",.5" offset="0,.63889mm"/>
                 <w10:wrap anchorx="page" anchory="page"/>
@@ -3530,7 +5293,7 @@
           </mc:Choice>
           <mc:Fallback>
             <w:pict>
-              <v:shape w14:anchorId="031A684A" id="Straight Arrow Connector 13" o:spid="_x0000_s1026" type="#_x0000_t32" style="position:absolute;margin-left:445pt;margin-top:627pt;width:88pt;height:73.5pt;flip:y;z-index:251675648;visibility:visible;mso-wrap-style:square;mso-width-percent:0;mso-height-percent:0;mso-wrap-distance-left:9pt;mso-wrap-distance-top:0;mso-wrap-distance-right:9pt;mso-wrap-distance-bottom:0;mso-position-horizontal:absolute;mso-position-horizontal-relative:page;mso-position-vertical:absolute;mso-position-vertical-relative:page;mso-width-percent:0;mso-height-percent:0;mso-width-relative:margin;mso-height-relative:margin" o:gfxdata="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" strokecolor="#f79646 [3209]" strokeweight="3pt">
+              <v:shape w14:anchorId="6A997F15" id="Straight Arrow Connector 13" o:spid="_x0000_s1026" type="#_x0000_t32" style="position:absolute;margin-left:445pt;margin-top:627pt;width:88pt;height:73.5pt;flip:y;z-index:251675648;visibility:visible;mso-wrap-style:square;mso-width-percent:0;mso-height-percent:0;mso-wrap-distance-left:9pt;mso-wrap-distance-top:0;mso-wrap-distance-right:9pt;mso-wrap-distance-bottom:0;mso-position-horizontal:absolute;mso-position-horizontal-relative:page;mso-position-vertical:absolute;mso-position-vertical-relative:page;mso-width-percent:0;mso-height-percent:0;mso-width-relative:margin;mso-height-relative:margin" o:gfxdata="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" strokecolor="#f79646 [3209]" strokeweight="3pt">
                 <v:stroke endarrow="block"/>
                 <v:shadow on="t" color="black" opacity="22937f" origin=",.5" offset="0,.63889mm"/>
                 <w10:wrap anchorx="page" anchory="page"/>
@@ -3604,7 +5367,7 @@
           </mc:Choice>
           <mc:Fallback>
             <w:pict>
-              <v:shape w14:anchorId="144CA3EE" id="Straight Arrow Connector 13" o:spid="_x0000_s1026" type="#_x0000_t32" style="position:absolute;margin-left:318pt;margin-top:620pt;width:112.5pt;height:78pt;z-index:251673600;visibility:visible;mso-wrap-style:square;mso-width-percent:0;mso-height-percent:0;mso-wrap-distance-left:9pt;mso-wrap-distance-top:0;mso-wrap-distance-right:9pt;mso-wrap-distance-bottom:0;mso-position-horizontal:absolute;mso-position-horizontal-relative:page;mso-position-vertical:absolute;mso-position-vertical-relative:page;mso-width-percent:0;mso-height-percent:0;mso-width-relative:margin;mso-height-relative:margin" o:gfxdata="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" strokecolor="#f79646 [3209]" strokeweight="3pt">
+              <v:shape w14:anchorId="28F84D91" id="Straight Arrow Connector 13" o:spid="_x0000_s1026" type="#_x0000_t32" style="position:absolute;margin-left:318pt;margin-top:620pt;width:112.5pt;height:78pt;z-index:251673600;visibility:visible;mso-wrap-style:square;mso-width-percent:0;mso-height-percent:0;mso-wrap-distance-left:9pt;mso-wrap-distance-top:0;mso-wrap-distance-right:9pt;mso-wrap-distance-bottom:0;mso-position-horizontal:absolute;mso-position-horizontal-relative:page;mso-position-vertical:absolute;mso-position-vertical-relative:page;mso-width-percent:0;mso-height-percent:0;mso-width-relative:margin;mso-height-relative:margin" o:gfxdata="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" strokecolor="#f79646 [3209]" strokeweight="3pt">
                 <v:stroke endarrow="block"/>
                 <v:shadow on="t" color="black" opacity="22937f" origin=",.5" offset="0,.63889mm"/>
                 <w10:wrap anchorx="page" anchory="page"/>
@@ -3678,7 +5441,7 @@
           </mc:Choice>
           <mc:Fallback>
             <w:pict>
-              <v:shape w14:anchorId="7467A0F5" id="Straight Arrow Connector 13" o:spid="_x0000_s1026" type="#_x0000_t32" style="position:absolute;margin-left:268pt;margin-top:620.5pt;width:18pt;height:45.5pt;flip:y;z-index:251672576;visibility:visible;mso-wrap-style:square;mso-width-percent:0;mso-height-percent:0;mso-wrap-distance-left:9pt;mso-wrap-distance-top:0;mso-wrap-distance-right:9pt;mso-wrap-distance-bottom:0;mso-position-horizontal:absolute;mso-position-horizontal-relative:page;mso-position-vertical:absolute;mso-position-vertical-relative:page;mso-width-percent:0;mso-height-percent:0;mso-width-relative:margin;mso-height-relative:margin" o:gfxdata="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" strokecolor="#f79646 [3209]" strokeweight="3pt">
+              <v:shape w14:anchorId="57502E5B" id="Straight Arrow Connector 13" o:spid="_x0000_s1026" type="#_x0000_t32" style="position:absolute;margin-left:268pt;margin-top:620.5pt;width:18pt;height:45.5pt;flip:y;z-index:251672576;visibility:visible;mso-wrap-style:square;mso-width-percent:0;mso-height-percent:0;mso-wrap-distance-left:9pt;mso-wrap-distance-top:0;mso-wrap-distance-right:9pt;mso-wrap-distance-bottom:0;mso-position-horizontal:absolute;mso-position-horizontal-relative:page;mso-position-vertical:absolute;mso-position-vertical-relative:page;mso-width-percent:0;mso-height-percent:0;mso-width-relative:margin;mso-height-relative:margin" o:gfxdata="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" strokecolor="#f79646 [3209]" strokeweight="3pt">
                 <v:stroke endarrow="block"/>
                 <v:shadow on="t" color="black" opacity="22937f" origin=",.5" offset="0,.63889mm"/>
                 <w10:wrap anchorx="page" anchory="page"/>
@@ -3752,7 +5515,7 @@
           </mc:Choice>
           <mc:Fallback>
             <w:pict>
-              <v:shape w14:anchorId="0D541D89" id="Straight Arrow Connector 11" o:spid="_x0000_s1026" type="#_x0000_t32" style="position:absolute;margin-left:78pt;margin-top:619pt;width:28pt;height:3.6pt;flip:y;z-index:251639808;visibility:visible;mso-wrap-style:square;mso-width-percent:0;mso-height-percent:0;mso-wrap-distance-left:9pt;mso-wrap-distance-top:0;mso-wrap-distance-right:9pt;mso-wrap-distance-bottom:0;mso-position-horizontal:absolute;mso-position-horizontal-relative:page;mso-position-vertical:absolute;mso-position-vertical-relative:page;mso-width-percent:0;mso-height-percent:0;mso-width-relative:margin;mso-height-relative:margin" o:gfxdata="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" strokecolor="#4579b8 [3044]">
+              <v:shape w14:anchorId="5F57841B" id="Straight Arrow Connector 11" o:spid="_x0000_s1026" type="#_x0000_t32" style="position:absolute;margin-left:78pt;margin-top:619pt;width:28pt;height:3.6pt;flip:y;z-index:251639808;visibility:visible;mso-wrap-style:square;mso-width-percent:0;mso-height-percent:0;mso-wrap-distance-left:9pt;mso-wrap-distance-top:0;mso-wrap-distance-right:9pt;mso-wrap-distance-bottom:0;mso-position-horizontal:absolute;mso-position-horizontal-relative:page;mso-position-vertical:absolute;mso-position-vertical-relative:page;mso-width-percent:0;mso-height-percent:0;mso-width-relative:margin;mso-height-relative:margin" o:gfxdata="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" strokecolor="#4579b8 [3044]">
                 <v:stroke endarrow="block"/>
                 <w10:wrap anchorx="page" anchory="page"/>
               </v:shape>
@@ -3833,7 +5596,7 @@
           </mc:Choice>
           <mc:Fallback>
             <w:pict>
-              <v:shape w14:anchorId="48D82BC2" id="Straight Arrow Connector 13" o:spid="_x0000_s1026" type="#_x0000_t32" style="position:absolute;margin-left:468pt;margin-top:644.5pt;width:67pt;height:53.5pt;flip:y;z-index:251664384;visibility:visible;mso-wrap-style:square;mso-width-percent:0;mso-height-percent:0;mso-wrap-distance-left:9pt;mso-wrap-distance-top:0;mso-wrap-distance-right:9pt;mso-wrap-distance-bottom:0;mso-position-horizontal:absolute;mso-position-horizontal-relative:page;mso-position-vertical:absolute;mso-position-vertical-relative:page;mso-width-percent:0;mso-height-percent:0;mso-width-relative:margin;mso-height-relative:margin" o:gfxdata="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" strokecolor="#4f81bd [3204]" strokeweight="3pt">
+              <v:shape w14:anchorId="73207BF8" id="Straight Arrow Connector 13" o:spid="_x0000_s1026" type="#_x0000_t32" style="position:absolute;margin-left:468pt;margin-top:644.5pt;width:67pt;height:53.5pt;flip:y;z-index:251664384;visibility:visible;mso-wrap-style:square;mso-width-percent:0;mso-height-percent:0;mso-wrap-distance-left:9pt;mso-wrap-distance-top:0;mso-wrap-distance-right:9pt;mso-wrap-distance-bottom:0;mso-position-horizontal:absolute;mso-position-horizontal-relative:page;mso-position-vertical:absolute;mso-position-vertical-relative:page;mso-width-percent:0;mso-height-percent:0;mso-width-relative:margin;mso-height-relative:margin" o:gfxdata="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" strokecolor="#4f81bd [3204]" strokeweight="3pt">
                 <v:stroke endarrow="block"/>
                 <v:shadow on="t" color="black" opacity="22937f" origin=",.5" offset="0,.63889mm"/>
                 <w10:wrap anchorx="page" anchory="page"/>
@@ -3907,7 +5670,7 @@
           </mc:Choice>
           <mc:Fallback>
             <w:pict>
-              <v:shape w14:anchorId="39A89641" id="Straight Arrow Connector 11" o:spid="_x0000_s1026" type="#_x0000_t32" style="position:absolute;margin-left:79.5pt;margin-top:644.5pt;width:30pt;height:16pt;z-index:251640832;visibility:visible;mso-wrap-style:square;mso-width-percent:0;mso-height-percent:0;mso-wrap-distance-left:9pt;mso-wrap-distance-top:0;mso-wrap-distance-right:9pt;mso-wrap-distance-bottom:0;mso-position-horizontal:absolute;mso-position-horizontal-relative:page;mso-position-vertical:absolute;mso-position-vertical-relative:page;mso-width-percent:0;mso-height-percent:0;mso-width-relative:margin;mso-height-relative:margin" o:gfxdata="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" strokecolor="#4579b8 [3044]">
+              <v:shape w14:anchorId="26D5FE2E" id="Straight Arrow Connector 11" o:spid="_x0000_s1026" type="#_x0000_t32" style="position:absolute;margin-left:79.5pt;margin-top:644.5pt;width:30pt;height:16pt;z-index:251640832;visibility:visible;mso-wrap-style:square;mso-width-percent:0;mso-height-percent:0;mso-wrap-distance-left:9pt;mso-wrap-distance-top:0;mso-wrap-distance-right:9pt;mso-wrap-distance-bottom:0;mso-position-horizontal:absolute;mso-position-horizontal-relative:page;mso-position-vertical:absolute;mso-position-vertical-relative:page;mso-width-percent:0;mso-height-percent:0;mso-width-relative:margin;mso-height-relative:margin" o:gfxdata="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" strokecolor="#4579b8 [3044]">
                 <v:stroke endarrow="block"/>
                 <w10:wrap anchorx="page" anchory="page"/>
               </v:shape>
@@ -3980,7 +5743,7 @@
           </mc:Choice>
           <mc:Fallback>
             <w:pict>
-              <v:shape w14:anchorId="4A50D43D" id="Straight Arrow Connector 11" o:spid="_x0000_s1026" type="#_x0000_t32" style="position:absolute;margin-left:77.5pt;margin-top:663pt;width:35pt;height:40.5pt;z-index:251642880;visibility:visible;mso-wrap-style:square;mso-width-percent:0;mso-height-percent:0;mso-wrap-distance-left:9pt;mso-wrap-distance-top:0;mso-wrap-distance-right:9pt;mso-wrap-distance-bottom:0;mso-position-horizontal:absolute;mso-position-horizontal-relative:page;mso-position-vertical:absolute;mso-position-vertical-relative:page;mso-width-percent:0;mso-height-percent:0;mso-width-relative:margin;mso-height-relative:margin" o:gfxdata="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" strokecolor="#4579b8 [3044]">
+              <v:shape w14:anchorId="4D9C1EFE" id="Straight Arrow Connector 11" o:spid="_x0000_s1026" type="#_x0000_t32" style="position:absolute;margin-left:77.5pt;margin-top:663pt;width:35pt;height:40.5pt;z-index:251642880;visibility:visible;mso-wrap-style:square;mso-width-percent:0;mso-height-percent:0;mso-wrap-distance-left:9pt;mso-wrap-distance-top:0;mso-wrap-distance-right:9pt;mso-wrap-distance-bottom:0;mso-position-horizontal:absolute;mso-position-horizontal-relative:page;mso-position-vertical:absolute;mso-position-vertical-relative:page;mso-width-percent:0;mso-height-percent:0;mso-width-relative:margin;mso-height-relative:margin" o:gfxdata="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" strokecolor="#4579b8 [3044]">
                 <v:stroke endarrow="block"/>
                 <w10:wrap anchorx="page" anchory="page"/>
               </v:shape>
@@ -4189,7 +5952,7 @@
           </mc:Choice>
           <mc:Fallback>
             <w:pict>
-              <v:shape w14:anchorId="403B994B" id="Straight Arrow Connector 13" o:spid="_x0000_s1026" type="#_x0000_t32" style="position:absolute;margin-left:305.5pt;margin-top:685.5pt;width:110.5pt;height:16pt;z-index:251663360;visibility:visible;mso-wrap-style:square;mso-width-percent:0;mso-height-percent:0;mso-wrap-distance-left:9pt;mso-wrap-distance-top:0;mso-wrap-distance-right:9pt;mso-wrap-distance-bottom:0;mso-position-horizontal:absolute;mso-position-horizontal-relative:page;mso-position-vertical:absolute;mso-position-vertical-relative:page;mso-width-percent:0;mso-height-percent:0;mso-width-relative:margin;mso-height-relative:margin" o:gfxdata="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" strokecolor="#4f81bd [3204]" strokeweight="3pt">
+              <v:shape w14:anchorId="16F2854C" id="Straight Arrow Connector 13" o:spid="_x0000_s1026" type="#_x0000_t32" style="position:absolute;margin-left:305.5pt;margin-top:685.5pt;width:110.5pt;height:16pt;z-index:251663360;visibility:visible;mso-wrap-style:square;mso-width-percent:0;mso-height-percent:0;mso-wrap-distance-left:9pt;mso-wrap-distance-top:0;mso-wrap-distance-right:9pt;mso-wrap-distance-bottom:0;mso-position-horizontal:absolute;mso-position-horizontal-relative:page;mso-position-vertical:absolute;mso-position-vertical-relative:page;mso-width-percent:0;mso-height-percent:0;mso-width-relative:margin;mso-height-relative:margin" o:gfxdata="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" strokecolor="#4f81bd [3204]" strokeweight="3pt">
                 <v:stroke endarrow="block"/>
                 <v:shadow on="t" color="black" opacity="22937f" origin=",.5" offset="0,.63889mm"/>
                 <w10:wrap anchorx="page" anchory="page"/>
@@ -4661,10 +6424,12 @@
       <w:pPr>
         <w:pStyle w:val="Heading3"/>
       </w:pPr>
+      <w:bookmarkStart w:id="5" w:name="_Toc235569377"/>
       <w:r>
         <w:lastRenderedPageBreak/>
         <w:t>Self-Assessment:</w:t>
       </w:r>
+      <w:bookmarkEnd w:id="5"/>
     </w:p>
     <w:p>
       <w:r>
@@ -4680,17 +6445,21 @@
       <w:pPr>
         <w:pStyle w:val="Heading1"/>
       </w:pPr>
+      <w:bookmarkStart w:id="6" w:name="_Toc235569378"/>
       <w:r>
         <w:t>2.3 Methods of Data Transmission</w:t>
       </w:r>
+      <w:bookmarkEnd w:id="6"/>
     </w:p>
     <w:p>
       <w:pPr>
         <w:pStyle w:val="Heading2"/>
       </w:pPr>
+      <w:bookmarkStart w:id="7" w:name="_Toc235569379"/>
       <w:r>
         <w:t>Question</w:t>
       </w:r>
+      <w:bookmarkEnd w:id="7"/>
     </w:p>
     <w:p>
       <w:r>
@@ -4955,9 +6724,11 @@
       <w:pPr>
         <w:pStyle w:val="Heading2"/>
       </w:pPr>
+      <w:bookmarkStart w:id="8" w:name="_Toc235569380"/>
       <w:r>
         <w:t>Activity 2.3</w:t>
       </w:r>
+      <w:bookmarkEnd w:id="8"/>
     </w:p>
     <w:p>
       <w:r>
@@ -5008,9 +6779,11 @@
       <w:pPr>
         <w:pStyle w:val="Heading2"/>
       </w:pPr>
+      <w:bookmarkStart w:id="9" w:name="_Toc235569381"/>
       <w:r>
         <w:t>Activity 2.4</w:t>
       </w:r>
+      <w:bookmarkEnd w:id="9"/>
     </w:p>
     <w:p>
       <w:r>
@@ -5058,22 +6831,26 @@
       <w:pPr>
         <w:pStyle w:val="Heading1"/>
       </w:pPr>
+      <w:bookmarkStart w:id="10" w:name="_Toc235569382"/>
       <w:r>
         <w:t>2.4</w:t>
       </w:r>
       <w:r>
         <w:t xml:space="preserve"> The Universal Serial Bus (USB) Interface</w:t>
       </w:r>
+      <w:bookmarkEnd w:id="10"/>
     </w:p>
     <w:p/>
     <w:p>
       <w:pPr>
         <w:pStyle w:val="Heading2"/>
       </w:pPr>
+      <w:bookmarkStart w:id="11" w:name="_Toc235569383"/>
       <w:r>
         <w:lastRenderedPageBreak/>
         <w:t>Activity 2.5</w:t>
       </w:r>
+      <w:bookmarkEnd w:id="11"/>
     </w:p>
     <w:p>
       <w:r>
@@ -5149,9 +6926,11 @@
       <w:pPr>
         <w:pStyle w:val="Heading2"/>
       </w:pPr>
+      <w:bookmarkStart w:id="12" w:name="_Toc235569384"/>
       <w:r>
         <w:t>ACTIVITY 2.6</w:t>
       </w:r>
+      <w:bookmarkEnd w:id="12"/>
     </w:p>
     <w:p>
       <w:r>
@@ -5282,9 +7061,11 @@
       <w:pPr>
         <w:pStyle w:val="Heading3"/>
       </w:pPr>
+      <w:bookmarkStart w:id="13" w:name="_Toc235569385"/>
       <w:r>
         <w:t>COMPUTER SCIENCE IN CONTEXT</w:t>
       </w:r>
+      <w:bookmarkEnd w:id="13"/>
     </w:p>
     <w:p>
       <w:r>
@@ -5296,9 +7077,11 @@
       <w:pPr>
         <w:pStyle w:val="Heading2"/>
       </w:pPr>
+      <w:bookmarkStart w:id="14" w:name="_Toc235569386"/>
       <w:r>
         <w:t>Questions</w:t>
       </w:r>
+      <w:bookmarkEnd w:id="14"/>
     </w:p>
     <w:p>
       <w:r>
@@ -5482,17 +7265,21 @@
       <w:pPr>
         <w:pStyle w:val="Heading1"/>
       </w:pPr>
+      <w:bookmarkStart w:id="15" w:name="_Toc235569387"/>
       <w:r>
         <w:t>2.5 Detecting Errors in Data Transmission</w:t>
       </w:r>
+      <w:bookmarkEnd w:id="15"/>
     </w:p>
     <w:p>
       <w:pPr>
         <w:pStyle w:val="Heading2"/>
       </w:pPr>
+      <w:bookmarkStart w:id="16" w:name="_Toc235569388"/>
       <w:r>
         <w:t>Questions</w:t>
       </w:r>
+      <w:bookmarkEnd w:id="16"/>
     </w:p>
     <w:p>
       <w:r>
@@ -5704,9 +7491,11 @@
       <w:pPr>
         <w:pStyle w:val="Heading2"/>
       </w:pPr>
+      <w:bookmarkStart w:id="17" w:name="_Toc235569389"/>
       <w:r>
         <w:t>Activity 2.7</w:t>
       </w:r>
+      <w:bookmarkEnd w:id="17"/>
     </w:p>
     <w:p>
       <w:r>
@@ -5767,9 +7556,11 @@
       <w:pPr>
         <w:pStyle w:val="Heading2"/>
       </w:pPr>
+      <w:bookmarkStart w:id="18" w:name="_Toc235569390"/>
       <w:r>
         <w:t>Activity 2.8</w:t>
       </w:r>
+      <w:bookmarkEnd w:id="18"/>
     </w:p>
     <w:p>
       <w:r>
@@ -6095,7 +7886,7 @@
           </mc:Choice>
           <mc:Fallback>
             <w:pict>
-              <v:line w14:anchorId="2E9F27C6" id="Straight Connector 48" o:spid="_x0000_s1026" style="position:absolute;z-index:251620352;visibility:visible;mso-wrap-style:square;mso-wrap-distance-left:9pt;mso-wrap-distance-top:0;mso-wrap-distance-right:9pt;mso-wrap-distance-bottom:0;mso-position-horizontal:absolute;mso-position-horizontal-relative:page;mso-position-vertical:absolute;mso-position-vertical-relative:page" from="505.5pt,251pt" to="505.5pt,470.5pt" o:gfxdata="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" strokecolor="black [3213]">
+              <v:line w14:anchorId="0D75C14D" id="Straight Connector 48" o:spid="_x0000_s1026" style="position:absolute;z-index:251620352;visibility:visible;mso-wrap-style:square;mso-wrap-distance-left:9pt;mso-wrap-distance-top:0;mso-wrap-distance-right:9pt;mso-wrap-distance-bottom:0;mso-position-horizontal:absolute;mso-position-horizontal-relative:page;mso-position-vertical:absolute;mso-position-vertical-relative:page" from="505.5pt,251pt" to="505.5pt,470.5pt" o:gfxdata="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" strokecolor="black [3213]">
                 <w10:wrap anchorx="page" anchory="page"/>
               </v:line>
             </w:pict>
@@ -6163,7 +7954,7 @@
           </mc:Choice>
           <mc:Fallback>
             <w:pict>
-              <v:line w14:anchorId="12BEA0C3" id="Straight Connector 48" o:spid="_x0000_s1026" style="position:absolute;z-index:251619328;visibility:visible;mso-wrap-style:square;mso-wrap-distance-left:9pt;mso-wrap-distance-top:0;mso-wrap-distance-right:9pt;mso-wrap-distance-bottom:0;mso-position-horizontal:absolute;mso-position-horizontal-relative:page;mso-position-vertical:absolute;mso-position-vertical-relative:page" from="90pt,254.5pt" to="90pt,474pt" o:gfxdata="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" strokecolor="black [3213]">
+              <v:line w14:anchorId="160B3C79" id="Straight Connector 48" o:spid="_x0000_s1026" style="position:absolute;z-index:251619328;visibility:visible;mso-wrap-style:square;mso-wrap-distance-left:9pt;mso-wrap-distance-top:0;mso-wrap-distance-right:9pt;mso-wrap-distance-bottom:0;mso-position-horizontal:absolute;mso-position-horizontal-relative:page;mso-position-vertical:absolute;mso-position-vertical-relative:page" from="90pt,254.5pt" to="90pt,474pt" o:gfxdata="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" strokecolor="black [3213]">
                 <w10:wrap anchorx="page" anchory="page"/>
               </v:line>
             </w:pict>
@@ -6237,7 +8028,7 @@
           </mc:Choice>
           <mc:Fallback>
             <w:pict>
-              <v:shape w14:anchorId="20103177" id="Straight Arrow Connector 49" o:spid="_x0000_s1026" type="#_x0000_t32" style="position:absolute;margin-left:90pt;margin-top:278.55pt;width:416.5pt;height:3.6pt;flip:y;z-index:251629568;visibility:visible;mso-wrap-style:square;mso-width-percent:0;mso-height-percent:0;mso-wrap-distance-left:9pt;mso-wrap-distance-top:0;mso-wrap-distance-right:9pt;mso-wrap-distance-bottom:0;mso-position-horizontal:absolute;mso-position-horizontal-relative:page;mso-position-vertical:absolute;mso-position-vertical-relative:page;mso-width-percent:0;mso-height-percent:0;mso-width-relative:margin;mso-height-relative:margin" o:gfxdata="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" strokecolor="#4579b8 [3044]">
+              <v:shape w14:anchorId="78B71B70" id="Straight Arrow Connector 49" o:spid="_x0000_s1026" type="#_x0000_t32" style="position:absolute;margin-left:90pt;margin-top:278.55pt;width:416.5pt;height:3.6pt;flip:y;z-index:251629568;visibility:visible;mso-wrap-style:square;mso-width-percent:0;mso-height-percent:0;mso-wrap-distance-left:9pt;mso-wrap-distance-top:0;mso-wrap-distance-right:9pt;mso-wrap-distance-bottom:0;mso-position-horizontal:absolute;mso-position-horizontal-relative:page;mso-position-vertical:absolute;mso-position-vertical-relative:page;mso-width-percent:0;mso-height-percent:0;mso-width-relative:margin;mso-height-relative:margin" o:gfxdata="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" strokecolor="#4579b8 [3044]">
                 <v:stroke endarrow="block"/>
                 <w10:wrap anchorx="page" anchory="page"/>
               </v:shape>
@@ -6374,7 +8165,7 @@
           </mc:Choice>
           <mc:Fallback>
             <w:pict>
-              <v:shape w14:anchorId="0FF586B5" id="Straight Arrow Connector 49" o:spid="_x0000_s1026" type="#_x0000_t32" style="position:absolute;margin-left:90pt;margin-top:301pt;width:417pt;height:3.6pt;flip:x;z-index:251640832;visibility:visible;mso-wrap-style:square;mso-width-percent:0;mso-height-percent:0;mso-wrap-distance-left:9pt;mso-wrap-distance-top:0;mso-wrap-distance-right:9pt;mso-wrap-distance-bottom:0;mso-position-horizontal:absolute;mso-position-horizontal-relative:page;mso-position-vertical:absolute;mso-position-vertical-relative:page;mso-width-percent:0;mso-height-percent:0;mso-width-relative:margin;mso-height-relative:margin" o:gfxdata="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" strokecolor="#4579b8 [3044]">
+              <v:shape w14:anchorId="715BF932" id="Straight Arrow Connector 49" o:spid="_x0000_s1026" type="#_x0000_t32" style="position:absolute;margin-left:90pt;margin-top:301pt;width:417pt;height:3.6pt;flip:x;z-index:251640832;visibility:visible;mso-wrap-style:square;mso-width-percent:0;mso-height-percent:0;mso-wrap-distance-left:9pt;mso-wrap-distance-top:0;mso-wrap-distance-right:9pt;mso-wrap-distance-bottom:0;mso-position-horizontal:absolute;mso-position-horizontal-relative:page;mso-position-vertical:absolute;mso-position-vertical-relative:page;mso-width-percent:0;mso-height-percent:0;mso-width-relative:margin;mso-height-relative:margin" o:gfxdata="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" strokecolor="#4579b8 [3044]">
                 <v:stroke endarrow="block"/>
                 <w10:wrap anchorx="page" anchory="page"/>
               </v:shape>
@@ -6475,7 +8266,7 @@
           </mc:Choice>
           <mc:Fallback>
             <w:pict>
-              <v:shape w14:anchorId="0B24B0B7" id="Straight Arrow Connector 49" o:spid="_x0000_s1026" type="#_x0000_t32" style="position:absolute;margin-left:89pt;margin-top:345pt;width:415pt;height:3.6pt;flip:y;z-index:251648000;visibility:visible;mso-wrap-style:square;mso-width-percent:0;mso-height-percent:0;mso-wrap-distance-left:9pt;mso-wrap-distance-top:0;mso-wrap-distance-right:9pt;mso-wrap-distance-bottom:0;mso-position-horizontal:absolute;mso-position-horizontal-relative:page;mso-position-vertical:absolute;mso-position-vertical-relative:page;mso-width-percent:0;mso-height-percent:0;mso-width-relative:margin;mso-height-relative:margin" o:gfxdata="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" strokecolor="#4579b8 [3044]">
+              <v:shape w14:anchorId="0517D5AB" id="Straight Arrow Connector 49" o:spid="_x0000_s1026" type="#_x0000_t32" style="position:absolute;margin-left:89pt;margin-top:345pt;width:415pt;height:3.6pt;flip:y;z-index:251648000;visibility:visible;mso-wrap-style:square;mso-width-percent:0;mso-height-percent:0;mso-wrap-distance-left:9pt;mso-wrap-distance-top:0;mso-wrap-distance-right:9pt;mso-wrap-distance-bottom:0;mso-position-horizontal:absolute;mso-position-horizontal-relative:page;mso-position-vertical:absolute;mso-position-vertical-relative:page;mso-width-percent:0;mso-height-percent:0;mso-width-relative:margin;mso-height-relative:margin" o:gfxdata="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" strokecolor="#4579b8 [3044]">
                 <v:stroke endarrow="block"/>
                 <w10:wrap anchorx="page" anchory="page"/>
               </v:shape>
@@ -6554,7 +8345,7 @@
           </mc:Choice>
           <mc:Fallback>
             <w:pict>
-              <v:shape w14:anchorId="04E347A6" id="Straight Arrow Connector 49" o:spid="_x0000_s1026" type="#_x0000_t32" style="position:absolute;margin-left:91.5pt;margin-top:375pt;width:415pt;height:3.6pt;flip:y;z-index:251654144;visibility:visible;mso-wrap-style:square;mso-width-percent:0;mso-height-percent:0;mso-wrap-distance-left:9pt;mso-wrap-distance-top:0;mso-wrap-distance-right:9pt;mso-wrap-distance-bottom:0;mso-position-horizontal:absolute;mso-position-horizontal-relative:page;mso-position-vertical:absolute;mso-position-vertical-relative:page;mso-width-percent:0;mso-height-percent:0;mso-width-relative:margin;mso-height-relative:margin" o:gfxdata="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" strokecolor="#4579b8 [3044]">
+              <v:shape w14:anchorId="254C67FE" id="Straight Arrow Connector 49" o:spid="_x0000_s1026" type="#_x0000_t32" style="position:absolute;margin-left:91.5pt;margin-top:375pt;width:415pt;height:3.6pt;flip:y;z-index:251654144;visibility:visible;mso-wrap-style:square;mso-width-percent:0;mso-height-percent:0;mso-wrap-distance-left:9pt;mso-wrap-distance-top:0;mso-wrap-distance-right:9pt;mso-wrap-distance-bottom:0;mso-position-horizontal:absolute;mso-position-horizontal-relative:page;mso-position-vertical:absolute;mso-position-vertical-relative:page;mso-width-percent:0;mso-height-percent:0;mso-width-relative:margin;mso-height-relative:margin" o:gfxdata="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" strokecolor="#4579b8 [3044]">
                 <v:stroke endarrow="block"/>
                 <w10:wrap anchorx="page" anchory="page"/>
               </v:shape>
@@ -6633,7 +8424,7 @@
           </mc:Choice>
           <mc:Fallback>
             <w:pict>
-              <v:shape w14:anchorId="1CD71E94" id="Straight Arrow Connector 49" o:spid="_x0000_s1026" type="#_x0000_t32" style="position:absolute;margin-left:92pt;margin-top:397pt;width:415pt;height:3.6pt;flip:y;z-index:251659264;visibility:visible;mso-wrap-style:square;mso-width-percent:0;mso-height-percent:0;mso-wrap-distance-left:9pt;mso-wrap-distance-top:0;mso-wrap-distance-right:9pt;mso-wrap-distance-bottom:0;mso-position-horizontal:absolute;mso-position-horizontal-relative:page;mso-position-vertical:absolute;mso-position-vertical-relative:page;mso-width-percent:0;mso-height-percent:0;mso-width-relative:margin;mso-height-relative:margin" o:gfxdata="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" strokecolor="#4579b8 [3044]">
+              <v:shape w14:anchorId="126F8CA0" id="Straight Arrow Connector 49" o:spid="_x0000_s1026" type="#_x0000_t32" style="position:absolute;margin-left:92pt;margin-top:397pt;width:415pt;height:3.6pt;flip:y;z-index:251659264;visibility:visible;mso-wrap-style:square;mso-width-percent:0;mso-height-percent:0;mso-wrap-distance-left:9pt;mso-wrap-distance-top:0;mso-wrap-distance-right:9pt;mso-wrap-distance-bottom:0;mso-position-horizontal:absolute;mso-position-horizontal-relative:page;mso-position-vertical:absolute;mso-position-vertical-relative:page;mso-width-percent:0;mso-height-percent:0;mso-width-relative:margin;mso-height-relative:margin" o:gfxdata="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" strokecolor="#4579b8 [3044]">
                 <v:stroke endarrow="block"/>
                 <w10:wrap anchorx="page" anchory="page"/>
               </v:shape>
@@ -6714,7 +8505,7 @@
           </mc:Choice>
           <mc:Fallback>
             <w:pict>
-              <v:shape w14:anchorId="665D1FC6" id="Straight Arrow Connector 49" o:spid="_x0000_s1026" type="#_x0000_t32" style="position:absolute;margin-left:89.5pt;margin-top:428pt;width:415pt;height:3.95pt;flip:x;z-index:251661312;visibility:visible;mso-wrap-style:square;mso-width-percent:0;mso-height-percent:0;mso-wrap-distance-left:9pt;mso-wrap-distance-top:0;mso-wrap-distance-right:9pt;mso-wrap-distance-bottom:0;mso-position-horizontal:absolute;mso-position-horizontal-relative:page;mso-position-vertical:absolute;mso-position-vertical-relative:page;mso-width-percent:0;mso-height-percent:0;mso-width-relative:margin;mso-height-relative:margin" o:gfxdata="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" strokecolor="#4579b8 [3044]">
+              <v:shape w14:anchorId="5717F279" id="Straight Arrow Connector 49" o:spid="_x0000_s1026" type="#_x0000_t32" style="position:absolute;margin-left:89.5pt;margin-top:428pt;width:415pt;height:3.95pt;flip:x;z-index:251661312;visibility:visible;mso-wrap-style:square;mso-width-percent:0;mso-height-percent:0;mso-wrap-distance-left:9pt;mso-wrap-distance-top:0;mso-wrap-distance-right:9pt;mso-wrap-distance-bottom:0;mso-position-horizontal:absolute;mso-position-horizontal-relative:page;mso-position-vertical:absolute;mso-position-vertical-relative:page;mso-width-percent:0;mso-height-percent:0;mso-width-relative:margin;mso-height-relative:margin" o:gfxdata="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" strokecolor="#4579b8 [3044]">
                 <v:stroke endarrow="block"/>
                 <w10:wrap anchorx="page" anchory="page"/>
               </v:shape>
@@ -6764,9 +8555,11 @@
       <w:pPr>
         <w:pStyle w:val="Heading2"/>
       </w:pPr>
+      <w:bookmarkStart w:id="19" w:name="_Toc235569391"/>
       <w:r>
         <w:t>Activity 2.9</w:t>
       </w:r>
+      <w:bookmarkEnd w:id="19"/>
     </w:p>
     <w:p>
       <w:r>
@@ -7010,7 +8803,7 @@
           </mc:Choice>
           <mc:Fallback>
             <w:pict>
-              <v:group w14:anchorId="24916B3F" id="Group 60" o:spid="_x0000_s1026" style="position:absolute;margin-left:107.9pt;margin-top:566pt;width:385.7pt;height:30.9pt;z-index:251681792;mso-position-horizontal-relative:page;mso-position-vertical-relative:page" coordsize="48981,3922" o:gfxdata="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">
+              <v:group w14:anchorId="123EA97D" id="Group 60" o:spid="_x0000_s1026" style="position:absolute;margin-left:107.9pt;margin-top:566pt;width:385.7pt;height:30.9pt;z-index:251681792;mso-position-horizontal-relative:page;mso-position-vertical-relative:page" coordsize="48981,3922" o:gfxdata="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">
                 <v:shapetype id="_x0000_t34" coordsize="21600,21600" o:spt="34" o:oned="t" adj="10800" path="m,l@0,0@0,21600,21600,21600e" filled="f">
                   <v:stroke joinstyle="miter"/>
                   <v:formulas>
@@ -7417,7 +9210,7 @@
           </mc:Choice>
           <mc:Fallback>
             <w:pict>
-              <v:shape w14:anchorId="762697BC" id="Straight Arrow Connector 53" o:spid="_x0000_s1026" type="#_x0000_t32" style="position:absolute;margin-left:162.5pt;margin-top:606.5pt;width:283pt;height:2.5pt;z-index:251679744;visibility:visible;mso-wrap-style:square;mso-wrap-distance-left:9pt;mso-wrap-distance-top:0;mso-wrap-distance-right:9pt;mso-wrap-distance-bottom:0;mso-position-horizontal:absolute;mso-position-horizontal-relative:page;mso-position-vertical:absolute;mso-position-vertical-relative:page" o:gfxdata="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" strokecolor="black [3040]" strokeweight="3pt">
+              <v:shape w14:anchorId="4B05A82D" id="Straight Arrow Connector 53" o:spid="_x0000_s1026" type="#_x0000_t32" style="position:absolute;margin-left:162.5pt;margin-top:606.5pt;width:283pt;height:2.5pt;z-index:251679744;visibility:visible;mso-wrap-style:square;mso-wrap-distance-left:9pt;mso-wrap-distance-top:0;mso-wrap-distance-right:9pt;mso-wrap-distance-bottom:0;mso-position-horizontal:absolute;mso-position-horizontal-relative:page;mso-position-vertical:absolute;mso-position-vertical-relative:page" o:gfxdata="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" strokecolor="black [3040]" strokeweight="3pt">
                 <v:stroke endarrow="block"/>
                 <w10:wrap anchorx="page" anchory="page"/>
               </v:shape>
@@ -7620,7 +9413,7 @@
           </mc:Choice>
           <mc:Fallback>
             <w:pict>
-              <v:shape w14:anchorId="3B0CE431" id="Straight Arrow Connector 56" o:spid="_x0000_s1026" type="#_x0000_t32" style="position:absolute;margin-left:158pt;margin-top:635.55pt;width:4in;height:3.6pt;flip:x y;z-index:251680768;visibility:visible;mso-wrap-style:square;mso-width-percent:0;mso-height-percent:0;mso-wrap-distance-left:9pt;mso-wrap-distance-top:0;mso-wrap-distance-right:9pt;mso-wrap-distance-bottom:0;mso-position-horizontal:absolute;mso-position-horizontal-relative:page;mso-position-vertical:absolute;mso-position-vertical-relative:page;mso-width-percent:0;mso-height-percent:0;mso-width-relative:margin;mso-height-relative:margin" o:gfxdata="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" strokecolor="black [3040]" strokeweight="3pt">
+              <v:shape w14:anchorId="4D8281B9" id="Straight Arrow Connector 56" o:spid="_x0000_s1026" type="#_x0000_t32" style="position:absolute;margin-left:158pt;margin-top:635.55pt;width:4in;height:3.6pt;flip:x y;z-index:251680768;visibility:visible;mso-wrap-style:square;mso-width-percent:0;mso-height-percent:0;mso-wrap-distance-left:9pt;mso-wrap-distance-top:0;mso-wrap-distance-right:9pt;mso-wrap-distance-bottom:0;mso-position-horizontal:absolute;mso-position-horizontal-relative:page;mso-position-vertical:absolute;mso-position-vertical-relative:page;mso-width-percent:0;mso-height-percent:0;mso-width-relative:margin;mso-height-relative:margin" o:gfxdata="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" strokecolor="black [3040]" strokeweight="3pt">
                 <v:stroke endarrow="block"/>
                 <w10:wrap anchorx="page" anchory="page"/>
               </v:shape>
@@ -7635,10 +9428,12 @@
       <w:pPr>
         <w:pStyle w:val="Heading2"/>
       </w:pPr>
+      <w:bookmarkStart w:id="20" w:name="_Toc235569392"/>
       <w:r>
         <w:lastRenderedPageBreak/>
         <w:t>Activity 2.10</w:t>
       </w:r>
+      <w:bookmarkEnd w:id="20"/>
     </w:p>
     <w:p>
       <w:r>
@@ -7808,7 +9603,7 @@
           </mc:Choice>
           <mc:Fallback>
             <w:pict>
-              <v:shape w14:anchorId="7A4ED104" id="Arc 64" o:spid="_x0000_s1026" style="position:absolute;margin-left:109.25pt;margin-top:129.7pt;width:309.15pt;height:48.15pt;z-index:251695104;visibility:visible;mso-wrap-style:square;mso-height-percent:0;mso-wrap-distance-left:9pt;mso-wrap-distance-top:0;mso-wrap-distance-right:9pt;mso-wrap-distance-bottom:0;mso-position-horizontal:absolute;mso-position-horizontal-relative:page;mso-position-vertical:absolute;mso-position-vertical-relative:page;mso-height-percent:0;mso-height-relative:margin;v-text-anchor:middle" coordsize="3926205,611505" o:gfxdata="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" path="m1445,317482nsc-38624,154931,745512,15953,1785677,1250v117236,-1657,235192,-1668,352442,-34c3150441,15329,3926207,147452,3926207,305751r-1963104,2l1445,317482xem1445,317482nfc-38624,154931,745512,15953,1785677,1250v117236,-1657,235192,-1668,352442,-34c3150441,15329,3926207,147452,3926207,305751e" filled="f" strokecolor="#4579b8 [3044]">
+              <v:shape w14:anchorId="29142884" id="Arc 64" o:spid="_x0000_s1026" style="position:absolute;margin-left:109.25pt;margin-top:129.7pt;width:309.15pt;height:48.15pt;z-index:251695104;visibility:visible;mso-wrap-style:square;mso-height-percent:0;mso-wrap-distance-left:9pt;mso-wrap-distance-top:0;mso-wrap-distance-right:9pt;mso-wrap-distance-bottom:0;mso-position-horizontal:absolute;mso-position-horizontal-relative:page;mso-position-vertical:absolute;mso-position-vertical-relative:page;mso-height-percent:0;mso-height-relative:margin;v-text-anchor:middle" coordsize="3926205,611505" o:gfxdata="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" path="m1445,317482nsc-38624,154931,745512,15953,1785677,1250v117236,-1657,235192,-1668,352442,-34c3150441,15329,3926207,147452,3926207,305751r-1963104,2l1445,317482xem1445,317482nfc-38624,154931,745512,15953,1785677,1250v117236,-1657,235192,-1668,352442,-34c3150441,15329,3926207,147452,3926207,305751e" filled="f" strokecolor="#4579b8 [3044]">
                 <v:path arrowok="t" o:connecttype="custom" o:connectlocs="1445,317482;1785677,1250;2138119,1216;3926207,305751" o:connectangles="0,0,0,0"/>
                 <w10:wrap anchorx="page" anchory="page"/>
               </v:shape>
@@ -7913,7 +9708,7 @@
           </mc:Choice>
           <mc:Fallback>
             <w:pict>
-              <v:shape w14:anchorId="2976A79A" id="Straight Arrow Connector 63" o:spid="_x0000_s1026" type="#_x0000_t32" style="position:absolute;margin-left:128.95pt;margin-top:166.95pt;width:269.05pt;height:3.6pt;z-index:251685888;visibility:visible;mso-wrap-style:square;mso-width-percent:0;mso-wrap-distance-left:9pt;mso-wrap-distance-top:0;mso-wrap-distance-right:9pt;mso-wrap-distance-bottom:0;mso-position-horizontal:absolute;mso-position-horizontal-relative:page;mso-position-vertical:absolute;mso-position-vertical-relative:page;mso-width-percent:0;mso-width-relative:margin" o:gfxdata="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" strokecolor="#4579b8 [3044]">
+              <v:shape w14:anchorId="0DE8899C" id="Straight Arrow Connector 63" o:spid="_x0000_s1026" type="#_x0000_t32" style="position:absolute;margin-left:128.95pt;margin-top:166.95pt;width:269.05pt;height:3.6pt;z-index:251685888;visibility:visible;mso-wrap-style:square;mso-width-percent:0;mso-wrap-distance-left:9pt;mso-wrap-distance-top:0;mso-wrap-distance-right:9pt;mso-wrap-distance-bottom:0;mso-position-horizontal:absolute;mso-position-horizontal-relative:page;mso-position-vertical:absolute;mso-position-vertical-relative:page;mso-width-percent:0;mso-width-relative:margin" o:gfxdata="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" strokecolor="#4579b8 [3044]">
                 <v:stroke endarrow="block"/>
                 <w10:wrap anchorx="page" anchory="page"/>
               </v:shape>
@@ -8101,7 +9896,7 @@
           </mc:Choice>
           <mc:Fallback>
             <w:pict>
-              <v:shape w14:anchorId="508850BF" id="Straight Arrow Connector 66" o:spid="_x0000_s1026" type="#_x0000_t32" style="position:absolute;margin-left:135.45pt;margin-top:192.55pt;width:247.9pt;height:3.6pt;flip:x y;z-index:251697152;visibility:visible;mso-wrap-style:square;mso-width-percent:0;mso-height-percent:0;mso-wrap-distance-left:9pt;mso-wrap-distance-top:0;mso-wrap-distance-right:9pt;mso-wrap-distance-bottom:0;mso-position-horizontal:absolute;mso-position-horizontal-relative:page;mso-position-vertical:absolute;mso-position-vertical-relative:page;mso-width-percent:0;mso-height-percent:0;mso-width-relative:margin;mso-height-relative:margin" o:gfxdata="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" strokecolor="#4579b8 [3044]">
+              <v:shape w14:anchorId="1B08B214" id="Straight Arrow Connector 66" o:spid="_x0000_s1026" type="#_x0000_t32" style="position:absolute;margin-left:135.45pt;margin-top:192.55pt;width:247.9pt;height:3.6pt;flip:x y;z-index:251697152;visibility:visible;mso-wrap-style:square;mso-width-percent:0;mso-height-percent:0;mso-wrap-distance-left:9pt;mso-wrap-distance-top:0;mso-wrap-distance-right:9pt;mso-wrap-distance-bottom:0;mso-position-horizontal:absolute;mso-position-horizontal-relative:page;mso-position-vertical:absolute;mso-position-vertical-relative:page;mso-width-percent:0;mso-height-percent:0;mso-width-relative:margin;mso-height-relative:margin" o:gfxdata="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" strokecolor="#4579b8 [3044]">
                 <v:stroke endarrow="block"/>
                 <w10:wrap anchorx="page" anchory="page"/>
               </v:shape>
@@ -8297,7 +10092,7 @@
           </mc:Choice>
           <mc:Fallback>
             <w:pict>
-              <v:shape w14:anchorId="3FE57043" id="Straight Arrow Connector 67" o:spid="_x0000_s1026" type="#_x0000_t32" style="position:absolute;margin-left:132.85pt;margin-top:214.2pt;width:259.9pt;height:3.6pt;z-index:251684864;visibility:visible;mso-wrap-style:square;mso-width-percent:0;mso-height-percent:0;mso-wrap-distance-left:9pt;mso-wrap-distance-top:0;mso-wrap-distance-right:9pt;mso-wrap-distance-bottom:0;mso-position-horizontal:absolute;mso-position-horizontal-relative:page;mso-position-vertical:absolute;mso-position-vertical-relative:page;mso-width-percent:0;mso-height-percent:0;mso-width-relative:margin;mso-height-relative:margin" o:gfxdata="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" strokecolor="#4579b8 [3044]">
+              <v:shape w14:anchorId="5F0DB961" id="Straight Arrow Connector 67" o:spid="_x0000_s1026" type="#_x0000_t32" style="position:absolute;margin-left:132.85pt;margin-top:214.2pt;width:259.9pt;height:3.6pt;z-index:251684864;visibility:visible;mso-wrap-style:square;mso-width-percent:0;mso-height-percent:0;mso-wrap-distance-left:9pt;mso-wrap-distance-top:0;mso-wrap-distance-right:9pt;mso-wrap-distance-bottom:0;mso-position-horizontal:absolute;mso-position-horizontal-relative:page;mso-position-vertical:absolute;mso-position-vertical-relative:page;mso-width-percent:0;mso-height-percent:0;mso-width-relative:margin;mso-height-relative:margin" o:gfxdata="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" strokecolor="#4579b8 [3044]">
                 <v:stroke endarrow="block"/>
                 <w10:wrap anchorx="page" anchory="page"/>
               </v:shape>
@@ -8320,9 +10115,11 @@
       <w:pPr>
         <w:pStyle w:val="Heading3"/>
       </w:pPr>
+      <w:bookmarkStart w:id="21" w:name="_Toc235569393"/>
       <w:r>
         <w:t>COMPUTER SCIENCE IN CONTEXT</w:t>
       </w:r>
+      <w:bookmarkEnd w:id="21"/>
     </w:p>
     <w:p>
       <w:r>
@@ -8334,18 +10131,22 @@
       <w:pPr>
         <w:pStyle w:val="Heading1"/>
       </w:pPr>
+      <w:bookmarkStart w:id="22" w:name="_Toc235569394"/>
       <w:r>
         <w:t>2.6 Encryption</w:t>
       </w:r>
+      <w:bookmarkEnd w:id="22"/>
     </w:p>
     <w:p/>
     <w:p>
       <w:pPr>
         <w:pStyle w:val="Heading2"/>
       </w:pPr>
+      <w:bookmarkStart w:id="23" w:name="_Toc235569395"/>
       <w:r>
         <w:t>Questions</w:t>
       </w:r>
+      <w:bookmarkEnd w:id="23"/>
     </w:p>
     <w:p>
       <w:r>
@@ -8401,9 +10202,11 @@
       <w:pPr>
         <w:pStyle w:val="Heading3"/>
       </w:pPr>
+      <w:bookmarkStart w:id="24" w:name="_Toc235569396"/>
       <w:r>
         <w:t>COMPUTER SCIENCE IN CONTEXT</w:t>
       </w:r>
+      <w:bookmarkEnd w:id="24"/>
     </w:p>
     <w:p>
       <w:r>
@@ -8419,6 +10222,56 @@
     </w:sectPr>
   </w:body>
 </w:document>
+</file>
+
+<file path=word/endnotes.xml><?xml version="1.0" encoding="utf-8"?>
+<w:endnotes xmlns:wpc="http://schemas.microsoft.com/office/word/2010/wordprocessingCanvas" xmlns:cx="http://schemas.microsoft.com/office/drawing/2014/chartex" xmlns:cx1="http://schemas.microsoft.com/office/drawing/2015/9/8/chartex" xmlns:cx2="http://schemas.microsoft.com/office/drawing/2015/10/21/chartex" xmlns:cx3="http://schemas.microsoft.com/office/drawing/2016/5/9/chartex" xmlns:cx4="http://schemas.microsoft.com/office/drawing/2016/5/10/chartex" xmlns:cx5="http://schemas.microsoft.com/office/drawing/2016/5/11/chartex" xmlns:cx6="http://schemas.microsoft.com/office/drawing/2016/5/12/chartex" xmlns:cx7="http://schemas.microsoft.com/office/drawing/2016/5/13/chartex" xmlns:cx8="http://schemas.microsoft.com/office/drawing/2016/5/14/chartex" xmlns:mc="http://schemas.openxmlformats.org/markup-compatibility/2006" xmlns:aink="http://schemas.microsoft.com/office/drawing/2016/ink" xmlns:am3d="http://schemas.microsoft.com/office/drawing/2017/model3d" xmlns:o="urn:schemas-microsoft-com:office:office" xmlns:oel="http://schemas.microsoft.com/office/2019/extlst" xmlns:r="http://schemas.openxmlformats.org/officeDocument/2006/relationships" xmlns:m="http://schemas.openxmlformats.org/officeDocument/2006/math" xmlns:v="urn:schemas-microsoft-com:vml" xmlns:wp14="http://schemas.microsoft.com/office/word/2010/wordprocessingDrawing" xmlns:wp="http://schemas.openxmlformats.org/drawingml/2006/wordprocessingDrawing" xmlns:w10="urn:schemas-microsoft-com:office:word" xmlns:w="http://schemas.openxmlformats.org/wordprocessingml/2006/main" xmlns:w14="http://schemas.microsoft.com/office/word/2010/wordml" xmlns:w15="http://schemas.microsoft.com/office/word/2012/wordml" xmlns:w16cex="http://schemas.microsoft.com/office/word/2018/wordml/cex" xmlns:w16cid="http://schemas.microsoft.com/office/word/2016/wordml/cid" xmlns:w16="http://schemas.microsoft.com/office/word/2018/wordml" xmlns:w16du="http://schemas.microsoft.com/office/word/2023/wordml/word16du" xmlns:w16sdtdh="http://schemas.microsoft.com/office/word/2020/wordml/sdtdatahash" xmlns:w16sdtfl="http://schemas.microsoft.com/office/word/2024/wordml/sdtformatlock" xmlns:w16se="http://schemas.microsoft.com/office/word/2015/wordml/symex" xmlns:wpg="http://schemas.microsoft.com/office/word/2010/wordprocessingGroup" xmlns:wpi="http://schemas.microsoft.com/office/word/2010/wordprocessingInk" xmlns:wne="http://schemas.microsoft.com/office/word/2006/wordml" xmlns:wps="http://schemas.microsoft.com/office/word/2010/wordprocessingShape" mc:Ignorable="w14 w15 w16se w16cid w16 w16cex w16sdtdh w16sdtfl w16du wp14">
+  <w:endnote w:type="separator" w:id="-1">
+    <w:p>
+      <w:pPr>
+        <w:spacing w:after="0" w:line="240" w:lineRule="auto"/>
+      </w:pPr>
+      <w:r>
+        <w:separator/>
+      </w:r>
+    </w:p>
+  </w:endnote>
+  <w:endnote w:type="continuationSeparator" w:id="0">
+    <w:p>
+      <w:pPr>
+        <w:spacing w:after="0" w:line="240" w:lineRule="auto"/>
+      </w:pPr>
+      <w:r>
+        <w:continuationSeparator/>
+      </w:r>
+    </w:p>
+  </w:endnote>
+</w:endnotes>
+</file>
+
+<file path=word/footnotes.xml><?xml version="1.0" encoding="utf-8"?>
+<w:footnotes xmlns:wpc="http://schemas.microsoft.com/office/word/2010/wordprocessingCanvas" xmlns:cx="http://schemas.microsoft.com/office/drawing/2014/chartex" xmlns:cx1="http://schemas.microsoft.com/office/drawing/2015/9/8/chartex" xmlns:cx2="http://schemas.microsoft.com/office/drawing/2015/10/21/chartex" xmlns:cx3="http://schemas.microsoft.com/office/drawing/2016/5/9/chartex" xmlns:cx4="http://schemas.microsoft.com/office/drawing/2016/5/10/chartex" xmlns:cx5="http://schemas.microsoft.com/office/drawing/2016/5/11/chartex" xmlns:cx6="http://schemas.microsoft.com/office/drawing/2016/5/12/chartex" xmlns:cx7="http://schemas.microsoft.com/office/drawing/2016/5/13/chartex" xmlns:cx8="http://schemas.microsoft.com/office/drawing/2016/5/14/chartex" xmlns:mc="http://schemas.openxmlformats.org/markup-compatibility/2006" xmlns:aink="http://schemas.microsoft.com/office/drawing/2016/ink" xmlns:am3d="http://schemas.microsoft.com/office/drawing/2017/model3d" xmlns:o="urn:schemas-microsoft-com:office:office" xmlns:oel="http://schemas.microsoft.com/office/2019/extlst" xmlns:r="http://schemas.openxmlformats.org/officeDocument/2006/relationships" xmlns:m="http://schemas.openxmlformats.org/officeDocument/2006/math" xmlns:v="urn:schemas-microsoft-com:vml" xmlns:wp14="http://schemas.microsoft.com/office/word/2010/wordprocessingDrawing" xmlns:wp="http://schemas.openxmlformats.org/drawingml/2006/wordprocessingDrawing" xmlns:w10="urn:schemas-microsoft-com:office:word" xmlns:w="http://schemas.openxmlformats.org/wordprocessingml/2006/main" xmlns:w14="http://schemas.microsoft.com/office/word/2010/wordml" xmlns:w15="http://schemas.microsoft.com/office/word/2012/wordml" xmlns:w16cex="http://schemas.microsoft.com/office/word/2018/wordml/cex" xmlns:w16cid="http://schemas.microsoft.com/office/word/2016/wordml/cid" xmlns:w16="http://schemas.microsoft.com/office/word/2018/wordml" xmlns:w16du="http://schemas.microsoft.com/office/word/2023/wordml/word16du" xmlns:w16sdtdh="http://schemas.microsoft.com/office/word/2020/wordml/sdtdatahash" xmlns:w16sdtfl="http://schemas.microsoft.com/office/word/2024/wordml/sdtformatlock" xmlns:w16se="http://schemas.microsoft.com/office/word/2015/wordml/symex" xmlns:wpg="http://schemas.microsoft.com/office/word/2010/wordprocessingGroup" xmlns:wpi="http://schemas.microsoft.com/office/word/2010/wordprocessingInk" xmlns:wne="http://schemas.microsoft.com/office/word/2006/wordml" xmlns:wps="http://schemas.microsoft.com/office/word/2010/wordprocessingShape" mc:Ignorable="w14 w15 w16se w16cid w16 w16cex w16sdtdh w16sdtfl w16du wp14">
+  <w:footnote w:type="separator" w:id="-1">
+    <w:p>
+      <w:pPr>
+        <w:spacing w:after="0" w:line="240" w:lineRule="auto"/>
+      </w:pPr>
+      <w:r>
+        <w:separator/>
+      </w:r>
+    </w:p>
+  </w:footnote>
+  <w:footnote w:type="continuationSeparator" w:id="0">
+    <w:p>
+      <w:pPr>
+        <w:spacing w:after="0" w:line="240" w:lineRule="auto"/>
+      </w:pPr>
+      <w:r>
+        <w:continuationSeparator/>
+      </w:r>
+    </w:p>
+  </w:footnote>
+</w:footnotes>
 </file>
 
 <file path=word/numbering.xml><?xml version="1.0" encoding="utf-8"?>
@@ -10914,6 +12767,118 @@
       <w:spacing w:val="5"/>
     </w:rPr>
   </w:style>
+  <w:style w:type="paragraph" w:styleId="Header">
+    <w:name w:val="header"/>
+    <w:basedOn w:val="Normal"/>
+    <w:link w:val="HeaderChar"/>
+    <w:uiPriority w:val="99"/>
+    <w:unhideWhenUsed/>
+    <w:rsid w:val="006F1348"/>
+    <w:pPr>
+      <w:tabs>
+        <w:tab w:val="center" w:pos="4680"/>
+        <w:tab w:val="right" w:pos="9360"/>
+      </w:tabs>
+      <w:spacing w:after="0" w:line="240" w:lineRule="auto"/>
+    </w:pPr>
+  </w:style>
+  <w:style w:type="character" w:customStyle="1" w:styleId="HeaderChar">
+    <w:name w:val="Header Char"/>
+    <w:basedOn w:val="DefaultParagraphFont"/>
+    <w:link w:val="Header"/>
+    <w:uiPriority w:val="99"/>
+    <w:rsid w:val="006F1348"/>
+  </w:style>
+  <w:style w:type="paragraph" w:styleId="Footer">
+    <w:name w:val="footer"/>
+    <w:basedOn w:val="Normal"/>
+    <w:link w:val="FooterChar"/>
+    <w:uiPriority w:val="99"/>
+    <w:unhideWhenUsed/>
+    <w:rsid w:val="006F1348"/>
+    <w:pPr>
+      <w:tabs>
+        <w:tab w:val="center" w:pos="4680"/>
+        <w:tab w:val="right" w:pos="9360"/>
+      </w:tabs>
+      <w:spacing w:after="0" w:line="240" w:lineRule="auto"/>
+    </w:pPr>
+  </w:style>
+  <w:style w:type="character" w:customStyle="1" w:styleId="FooterChar">
+    <w:name w:val="Footer Char"/>
+    <w:basedOn w:val="DefaultParagraphFont"/>
+    <w:link w:val="Footer"/>
+    <w:uiPriority w:val="99"/>
+    <w:rsid w:val="006F1348"/>
+  </w:style>
+  <w:style w:type="paragraph" w:styleId="TOCHeading">
+    <w:name w:val="TOC Heading"/>
+    <w:basedOn w:val="Heading1"/>
+    <w:next w:val="Normal"/>
+    <w:uiPriority w:val="39"/>
+    <w:unhideWhenUsed/>
+    <w:qFormat/>
+    <w:rsid w:val="006F1348"/>
+    <w:pPr>
+      <w:spacing w:before="240" w:after="0" w:line="259" w:lineRule="auto"/>
+      <w:outlineLvl w:val="9"/>
+    </w:pPr>
+    <w:rPr>
+      <w:rFonts w:asciiTheme="majorHAnsi" w:hAnsiTheme="majorHAnsi"/>
+      <w:color w:val="365F91" w:themeColor="accent1" w:themeShade="BF"/>
+      <w:sz w:val="32"/>
+      <w:szCs w:val="32"/>
+    </w:rPr>
+  </w:style>
+  <w:style w:type="paragraph" w:styleId="TOC1">
+    <w:name w:val="toc 1"/>
+    <w:basedOn w:val="Normal"/>
+    <w:next w:val="Normal"/>
+    <w:autoRedefine/>
+    <w:uiPriority w:val="39"/>
+    <w:unhideWhenUsed/>
+    <w:rsid w:val="006F1348"/>
+    <w:pPr>
+      <w:spacing w:after="100"/>
+    </w:pPr>
+  </w:style>
+  <w:style w:type="paragraph" w:styleId="TOC2">
+    <w:name w:val="toc 2"/>
+    <w:basedOn w:val="Normal"/>
+    <w:next w:val="Normal"/>
+    <w:autoRedefine/>
+    <w:uiPriority w:val="39"/>
+    <w:unhideWhenUsed/>
+    <w:rsid w:val="006F1348"/>
+    <w:pPr>
+      <w:spacing w:after="100"/>
+      <w:ind w:left="220"/>
+    </w:pPr>
+  </w:style>
+  <w:style w:type="paragraph" w:styleId="TOC3">
+    <w:name w:val="toc 3"/>
+    <w:basedOn w:val="Normal"/>
+    <w:next w:val="Normal"/>
+    <w:autoRedefine/>
+    <w:uiPriority w:val="39"/>
+    <w:unhideWhenUsed/>
+    <w:rsid w:val="006F1348"/>
+    <w:pPr>
+      <w:spacing w:after="100"/>
+      <w:ind w:left="440"/>
+    </w:pPr>
+  </w:style>
+  <w:style w:type="character" w:styleId="Hyperlink">
+    <w:name w:val="Hyperlink"/>
+    <w:basedOn w:val="DefaultParagraphFont"/>
+    <w:uiPriority w:val="99"/>
+    <w:unhideWhenUsed/>
+    <w:rsid w:val="006F1348"/>
+    <w:rPr>
+      <w:color w:val="0000FF" w:themeColor="hyperlink"/>
+      <w:u w:val="single"/>
+    </w:rPr>
+  </w:style>
 </w:styles>
 </file>
 

</xml_diff>